<commit_message>
fix: resolve duplicate reference [6], TOC hyperlink jumping, figure/table cross-references, and formula parser word collision
Co-authored-by: arena-agent <297053741+arena-agent@users.noreply.github.com>
</commit_message>
<xml_diff>
--- a/鲁东大学学术学位论文_Zotero活动引用版.docx
+++ b/鲁东大学学术学位论文_Zotero活动引用版.docx
@@ -776,7 +776,29 @@
     </w:p>
     <w:p>
       <w:r>
-        <w:t>根据学校写作规范，版面统一采用A4纸张（210mm×297mm），页边距设置为上3.0cm、下2.5cm、左3.0cm、右3.0cm，页眉距边界2.0cm，页脚距边界2.2cm。系统预置的核心页面参数如表2.1所示。</w:t>
+        <w:t>根据学校写作规范，版面统一采用A4纸张（210mm×297mm），页边距设置为上3.0cm、下2.5cm、左3.0cm、右3.0cm，页眉距边界2.0cm，页脚距边界2.2cm。系统预置的核心页面参数如</w:t>
+      </w:r>
+      <w:r>
+        <w:fldChar w:fldCharType="begin"/>
+      </w:r>
+      <w:r>
+        <w:instrText xml:space="preserve"> REF _RefTable2_1 \h </w:instrText>
+      </w:r>
+      <w:r>
+        <w:fldChar w:fldCharType="separate"/>
+      </w:r>
+      <w:r>
+        <w:rPr>
+          <w:rFonts w:ascii="Times New Roman" w:eastAsia="宋体" w:hAnsi="Times New Roman"/>
+          <w:color w:val="000000"/>
+        </w:rPr>
+        <w:t>表2.1</w:t>
+      </w:r>
+      <w:r>
+        <w:fldChar w:fldCharType="end"/>
+      </w:r>
+      <w:r>
+        <w:t>所示。</w:t>
       </w:r>
     </w:p>
     <w:p>
@@ -788,9 +810,11 @@
       </w:r>
     </w:p>
     <w:p>
+      <w:bookmarkStart w:id="101" w:name="_RefTable2_1"/>
       <w:r>
         <w:t>表2.1 鲁东大学学术学位论文版面与字体规范参数表</w:t>
       </w:r>
+      <w:bookmarkEnd w:id="101"/>
     </w:p>
     <w:tbl>
       <w:tblPr>
@@ -1081,7 +1105,29 @@
     </w:p>
     <w:p>
       <w:r>
-        <w:t>学校规范要求所有表格统一使用标准三线表。顶线与底线粗度为1.0磅，栏目线（表头下线）粗度为0.5磅。系统对常规表格的重构处理流程如图3.1所示。</w:t>
+        <w:t>学校规范要求所有表格统一使用标准三线表。顶线与底线粗度为1.0磅，栏目线（表头下线）粗度为0.5磅。系统对常规表格的重构处理流程如</w:t>
+      </w:r>
+      <w:r>
+        <w:fldChar w:fldCharType="begin"/>
+      </w:r>
+      <w:r>
+        <w:instrText xml:space="preserve"> REF _RefFigure3_1 \h </w:instrText>
+      </w:r>
+      <w:r>
+        <w:fldChar w:fldCharType="separate"/>
+      </w:r>
+      <w:r>
+        <w:rPr>
+          <w:rFonts w:ascii="Times New Roman" w:eastAsia="宋体" w:hAnsi="Times New Roman"/>
+          <w:color w:val="000000"/>
+        </w:rPr>
+        <w:t>图3.1</w:t>
+      </w:r>
+      <w:r>
+        <w:fldChar w:fldCharType="end"/>
+      </w:r>
+      <w:r>
+        <w:t>所示。</w:t>
       </w:r>
     </w:p>
     <w:p>
@@ -1098,9 +1144,11 @@
       </w:r>
     </w:p>
     <w:p>
+      <w:bookmarkStart w:id="102" w:name="_RefFigure3_1"/>
       <w:r>
         <w:t>图3.1 表格重构与多级编号管道处理流程示意图</w:t>
       </w:r>
+      <w:bookmarkEnd w:id="102"/>
     </w:p>
     <w:p>
       <w:pPr>

</xml_diff>

<commit_message>
feat: embed all 12 in-text active Zotero citation fields and active bibliography field
Co-authored-by: arena-agent <297053741+arena-agent@users.noreply.github.com>
</commit_message>
<xml_diff>
--- a/鲁东大学学术学位论文_Zotero活动引用版.docx
+++ b/鲁东大学学术学位论文_Zotero活动引用版.docx
@@ -144,7 +144,6 @@
           <w:p>
             <w:pPr>
               <w:spacing w:before="60" w:after="60"/>
-              <w:jc w:val="left"/>
             </w:pPr>
             <w:r>
               <w:rPr>
@@ -162,7 +161,6 @@
           <w:p>
             <w:pPr>
               <w:spacing w:before="60" w:after="60"/>
-              <w:jc w:val="left"/>
             </w:pPr>
             <w:r>
               <w:rPr>
@@ -183,7 +181,6 @@
           <w:p>
             <w:pPr>
               <w:spacing w:before="60" w:after="60"/>
-              <w:jc w:val="left"/>
             </w:pPr>
             <w:r>
               <w:rPr>
@@ -201,7 +198,6 @@
           <w:p>
             <w:pPr>
               <w:spacing w:before="60" w:after="60"/>
-              <w:jc w:val="left"/>
             </w:pPr>
             <w:r>
               <w:rPr>
@@ -222,7 +218,6 @@
           <w:p>
             <w:pPr>
               <w:spacing w:before="60" w:after="60"/>
-              <w:jc w:val="left"/>
             </w:pPr>
             <w:r>
               <w:rPr>
@@ -240,7 +235,6 @@
           <w:p>
             <w:pPr>
               <w:spacing w:before="60" w:after="60"/>
-              <w:jc w:val="left"/>
             </w:pPr>
             <w:r>
               <w:rPr>
@@ -261,7 +255,6 @@
           <w:p>
             <w:pPr>
               <w:spacing w:before="60" w:after="60"/>
-              <w:jc w:val="left"/>
             </w:pPr>
             <w:r>
               <w:rPr>
@@ -279,7 +272,6 @@
           <w:p>
             <w:pPr>
               <w:spacing w:before="60" w:after="60"/>
-              <w:jc w:val="left"/>
             </w:pPr>
             <w:r>
               <w:rPr>
@@ -300,7 +292,6 @@
           <w:p>
             <w:pPr>
               <w:spacing w:before="60" w:after="60"/>
-              <w:jc w:val="left"/>
             </w:pPr>
             <w:r>
               <w:rPr>
@@ -318,7 +309,6 @@
           <w:p>
             <w:pPr>
               <w:spacing w:before="60" w:after="60"/>
-              <w:jc w:val="left"/>
             </w:pPr>
             <w:r>
               <w:rPr>
@@ -339,7 +329,6 @@
           <w:p>
             <w:pPr>
               <w:spacing w:before="60" w:after="60"/>
-              <w:jc w:val="left"/>
             </w:pPr>
             <w:r>
               <w:rPr>
@@ -357,7 +346,6 @@
           <w:p>
             <w:pPr>
               <w:spacing w:before="60" w:after="60"/>
-              <w:jc w:val="left"/>
             </w:pPr>
             <w:r>
               <w:rPr>
@@ -685,7 +673,31 @@
     </w:p>
     <w:p>
       <w:r>
-        <w:t>随着教育部及高校对研究生学位论文规范化要求的不断深化，各高校均制定了详尽的学位论文写作规范。然而，在实际写作过程中，由于文字处理软件样式系统的复杂性，学生常常面临格式调整耗时费力、模板版本不一致、导出格式漂移等难题。研发一套符合学校官方规范的智能排版系统具有重要的应用价值与现实意义。</w:t>
+        <w:t>随着教育部及高校对研究生学位论文规范化要求的不断深化，各高校均制定了详尽的学位论文写作规范</w:t>
+      </w:r>
+      <w:fldSimple w:instr="ADDIN ZOTERO_ITEM CSL_CITATION {&quot;citationID&quot;: &quot;csl_chen_dengyuan_2000_1&quot;, &quot;properties&quot;: {&quot;formattedCitation&quot;: &quot;[1]&quot;, &quot;plainCitation&quot;: &quot;[1]&quot;, &quot;dontUpdate&quot;: false}, &quot;citationItems&quot;: [{&quot;id&quot;: &quot;chen_dengyuan_2000&quot;, &quot;itemData&quot;: {&quot;id&quot;: &quot;chen_dengyuan_2000&quot;, &quot;type&quot;: &quot;book&quot;, &quot;title&quot;: &quot;国史旧闻：第1卷&quot;, &quot;author&quot;: [{&quot;family&quot;: &quot;陈&quot;, &quot;given&quot;: &quot;登原&quot;}], &quot;publisher&quot;: &quot;中华书局&quot;, &quot;publisher-place&quot;: &quot;北京&quot;, &quot;issued&quot;: {&quot;date-parts&quot;: [[2000]]}, &quot;page&quot;: &quot;29&quot;}, &quot;uris&quot;: [&quot;http://zotero.org/users/local/items/chen_dengyuan_2000&quot;]}], &quot;schema&quot;: &quot;https://github.com/citation-style-language/schema/raw/master/csl-citation.json&quot;}">
+        <w:r>
+          <w:rPr>
+            <w:vertAlign w:val="superscript"/>
+            <w:rFonts w:ascii="Times New Roman" w:eastAsia="宋体" w:hAnsi="Times New Roman"/>
+          </w:rPr>
+          <w:t>[1]</w:t>
+        </w:r>
+      </w:fldSimple>
+      <w:r>
+        <w:t>。然而，在实际写作过程中，学生常常面临格式调整耗时费力、模板版本不一致、导出格式漂移等难题</w:t>
+      </w:r>
+      <w:fldSimple w:instr="ADDIN ZOTERO_ITEM CSL_CITATION {&quot;citationID&quot;: &quot;csl_yuan_xunlai_2012_2&quot;, &quot;properties&quot;: {&quot;formattedCitation&quot;: &quot;[2]&quot;, &quot;plainCitation&quot;: &quot;[2]&quot;, &quot;dontUpdate&quot;: false}, &quot;citationItems&quot;: [{&quot;id&quot;: &quot;yuan_xunlai_2012&quot;, &quot;itemData&quot;: {&quot;id&quot;: &quot;yuan_xunlai_2012&quot;, &quot;type&quot;: &quot;article-journal&quot;, &quot;title&quot;: &quot;蓝田生物群：一个认识多细胞生物起源和早期演化的新窗口&quot;, &quot;author&quot;: [{&quot;family&quot;: &quot;袁&quot;, &quot;given&quot;: &quot;训来&quot;}, {&quot;family&quot;: &quot;陈&quot;, &quot;given&quot;: &quot;哲&quot;}, {&quot;family&quot;: &quot;肖&quot;, &quot;given&quot;: &quot;书海&quot;}], &quot;container-title&quot;: &quot;科学通报&quot;, &quot;volume&quot;: &quot;55&quot;, &quot;issue&quot;: &quot;34&quot;, &quot;page&quot;: &quot;3219&quot;, &quot;issued&quot;: {&quot;date-parts&quot;: [[2012]]}}, &quot;uris&quot;: [&quot;http://zotero.org/users/local/items/yuan_xunlai_2012&quot;]}], &quot;schema&quot;: &quot;https://github.com/citation-style-language/schema/raw/master/csl-citation.json&quot;}">
+        <w:r>
+          <w:rPr>
+            <w:vertAlign w:val="superscript"/>
+            <w:rFonts w:ascii="Times New Roman" w:eastAsia="宋体" w:hAnsi="Times New Roman"/>
+          </w:rPr>
+          <w:t>[2]</w:t>
+        </w:r>
+      </w:fldSimple>
+      <w:r>
+        <w:t>。</w:t>
       </w:r>
     </w:p>
     <w:p>
@@ -698,7 +710,19 @@
     </w:p>
     <w:p>
       <w:r>
-        <w:t>目前，学术界与工业界在科技文献与学位论文排版方面主要形成了基于标记语言（如 LaTeX）和基于字处理宏扩展两条主要技术路线。</w:t>
+        <w:t>目前，学术界与工业界在科技文献与学位论文排版方面主要形成了基于标记语言和基于字处理宏扩展两条主要技术路线</w:t>
+      </w:r>
+      <w:fldSimple w:instr="ADDIN ZOTERO_ITEM CSL_CITATION {&quot;citationID&quot;: &quot;csl_harrison_waldron_2012_3&quot;, &quot;properties&quot;: {&quot;formattedCitation&quot;: &quot;[3]&quot;, &quot;plainCitation&quot;: &quot;[3]&quot;, &quot;dontUpdate&quot;: false}, &quot;citationItems&quot;: [{&quot;id&quot;: &quot;harrison_waldron_2012&quot;, &quot;itemData&quot;: {&quot;id&quot;: &quot;harrison_waldron_2012&quot;, &quot;type&quot;: &quot;book&quot;, &quot;title&quot;: &quot;经济数学与金融数学&quot;, &quot;author&quot;: [{&quot;family&quot;: &quot;哈里森&quot;, &quot;given&quot;: &quot;&quot;}, {&quot;family&quot;: &quot;沃尔德伦&quot;, &quot;given&quot;: &quot;&quot;}], &quot;translator&quot;: [{&quot;family&quot;: &quot;谢&quot;, &quot;given&quot;: &quot;远涛&quot;}], &quot;publisher&quot;: &quot;中国人民大学出版社&quot;, &quot;publisher-place&quot;: &quot;北京&quot;, &quot;issued&quot;: {&quot;date-parts&quot;: [[2012]]}, &quot;page&quot;: &quot;235-236&quot;}, &quot;uris&quot;: [&quot;http://zotero.org/users/local/items/harrison_waldron_2012&quot;]}], &quot;schema&quot;: &quot;https://github.com/citation-style-language/schema/raw/master/csl-citation.json&quot;}">
+        <w:r>
+          <w:rPr>
+            <w:vertAlign w:val="superscript"/>
+            <w:rFonts w:ascii="Times New Roman" w:eastAsia="宋体" w:hAnsi="Times New Roman"/>
+          </w:rPr>
+          <w:t>[3]</w:t>
+        </w:r>
+      </w:fldSimple>
+      <w:r>
+        <w:t>。</w:t>
       </w:r>
     </w:p>
     <w:p>
@@ -711,7 +735,19 @@
     </w:p>
     <w:p>
       <w:r>
-        <w:t>以 LaTeX 为代表的标记语言排版系统在数学公式、交叉引用和自动化编号方面具有极高精度，但其语法陡峭，对非计算机学科研究生学习成本较高。</w:t>
+        <w:t>以 LaTeX 为代表的标记语言排版系统在数学公式、交叉引用和自动化编号方面具有极高精度</w:t>
+      </w:r>
+      <w:fldSimple w:instr="ADDIN ZOTERO_ITEM CSL_CITATION {&quot;citationID&quot;: &quot;csl_marx_2013_4&quot;, &quot;properties&quot;: {&quot;formattedCitation&quot;: &quot;[4]&quot;, &quot;plainCitation&quot;: &quot;[4]&quot;, &quot;dontUpdate&quot;: false}, &quot;citationItems&quot;: [{&quot;id&quot;: &quot;marx_2013&quot;, &quot;itemData&quot;: {&quot;id&quot;: &quot;marx_2013&quot;, &quot;type&quot;: &quot;chapter&quot;, &quot;title&quot;: &quot;政治经济学批判&quot;, &quot;author&quot;: [{&quot;family&quot;: &quot;马克思&quot;, &quot;given&quot;: &quot;&quot;}], &quot;container-author&quot;: [{&quot;family&quot;: &quot;马克思&quot;, &quot;given&quot;: &quot;&quot;}, {&quot;family&quot;: &quot;恩格斯&quot;, &quot;given&quot;: &quot;&quot;}], &quot;container-title&quot;: &quot;马克思恩格斯全集：第35卷&quot;, &quot;publisher&quot;: &quot;人民出版社&quot;, &quot;publisher-place&quot;: &quot;北京&quot;, &quot;issued&quot;: {&quot;date-parts&quot;: [[2013]]}, &quot;page&quot;: &quot;302&quot;}, &quot;uris&quot;: [&quot;http://zotero.org/users/local/items/marx_2013&quot;]}], &quot;schema&quot;: &quot;https://github.com/citation-style-language/schema/raw/master/csl-citation.json&quot;}">
+        <w:r>
+          <w:rPr>
+            <w:vertAlign w:val="superscript"/>
+            <w:rFonts w:ascii="Times New Roman" w:eastAsia="宋体" w:hAnsi="Times New Roman"/>
+          </w:rPr>
+          <w:t>[4]</w:t>
+        </w:r>
+      </w:fldSimple>
+      <w:r>
+        <w:t>，但其语法陡峭，对非计算机学科研究生学习成本较高。</w:t>
       </w:r>
     </w:p>
     <w:p>
@@ -724,7 +760,19 @@
     </w:p>
     <w:p>
       <w:r>
-        <w:t>基于 Python-docx 或 VBA 的脚本工具能够对 Word 文档进行批处理，但现有工具多缺乏全局语义分区感知能力，容易出现封面被误冲刷、跨节页眉页码紊乱等问题。</w:t>
+        <w:t>基于 Python-docx 或 VBA 的脚本工具能够对 Word 文档进行批处理</w:t>
+      </w:r>
+      <w:fldSimple w:instr="ADDIN ZOTERO_ITEM CSL_CITATION {&quot;citationID&quot;: &quot;csl_feng_xiqiao_1997_5&quot;, &quot;properties&quot;: {&quot;formattedCitation&quot;: &quot;[5]&quot;, &quot;plainCitation&quot;: &quot;[5]&quot;, &quot;dontUpdate&quot;: false}, &quot;citationItems&quot;: [{&quot;id&quot;: &quot;feng_xiqiao_1997&quot;, &quot;itemData&quot;: {&quot;id&quot;: &quot;feng_xiqiao_1997&quot;, &quot;type&quot;: &quot;report&quot;, &quot;title&quot;: &quot;核反应堆压力管道与压力容器的LBB分析&quot;, &quot;author&quot;: [{&quot;family&quot;: &quot;冯&quot;, &quot;given&quot;: &quot;西桥&quot;}], &quot;publisher&quot;: &quot;清华大学核能技术设计研究院&quot;, &quot;publisher-place&quot;: &quot;北京&quot;, &quot;issued&quot;: {&quot;date-parts&quot;: [[1997]]}}, &quot;uris&quot;: [&quot;http://zotero.org/users/local/items/feng_xiqiao_1997&quot;]}], &quot;schema&quot;: &quot;https://github.com/citation-style-language/schema/raw/master/csl-citation.json&quot;}">
+        <w:r>
+          <w:rPr>
+            <w:vertAlign w:val="superscript"/>
+            <w:rFonts w:ascii="Times New Roman" w:eastAsia="宋体" w:hAnsi="Times New Roman"/>
+          </w:rPr>
+          <w:t>[5]</w:t>
+        </w:r>
+      </w:fldSimple>
+      <w:r>
+        <w:t>，但现有工具多缺乏全局语义分区感知能力，容易出现封面被误冲刷、跨节页眉页码紊乱等问题。</w:t>
       </w:r>
     </w:p>
     <w:p>
@@ -750,7 +798,19 @@
     </w:p>
     <w:p>
       <w:r>
-        <w:t>本章系统介绍排版引擎的分层架构设计以及面向鲁东大学学术学位规范的规则模型构建。</w:t>
+        <w:t>本章系统介绍排版引擎的分层架构设计以及面向鲁东大学学术学位规范的规则模型构建</w:t>
+      </w:r>
+      <w:fldSimple w:instr="ADDIN ZOTERO_ITEM CSL_CITATION {&quot;citationID&quot;: &quot;csl_chen_zhiyong_2011_6&quot;, &quot;properties&quot;: {&quot;formattedCitation&quot;: &quot;[6]&quot;, &quot;plainCitation&quot;: &quot;[6]&quot;, &quot;dontUpdate&quot;: false}, &quot;citationItems&quot;: [{&quot;id&quot;: &quot;chen_zhiyong_2011&quot;, &quot;itemData&quot;: {&quot;id&quot;: &quot;chen_zhiyong_2011&quot;, &quot;type&quot;: &quot;paper-conference&quot;, &quot;title&quot;: &quot;中国财税文化价值研究：“中国财税文化国际学术研讨会”论文集&quot;, &quot;author&quot;: [{&quot;family&quot;: &quot;陈&quot;, &quot;given&quot;: &quot;志勇&quot;}], &quot;publisher&quot;: &quot;经济科学出版社&quot;, &quot;publisher-place&quot;: &quot;北京&quot;, &quot;issued&quot;: {&quot;date-parts&quot;: [[2011]]}, &quot;accessed&quot;: {&quot;date-parts&quot;: [[2013, 10, 14]]}, &quot;URL&quot;: &quot;http://apabi.lib.pku.edu.cn/usp/pku/pub.mvc?pid=book.detail&amp;metaid=m.20110628-BPO-889-0135&amp;cult=CN&quot;}, &quot;uris&quot;: [&quot;http://zotero.org/users/local/items/chen_zhiyong_2011&quot;]}], &quot;schema&quot;: &quot;https://github.com/citation-style-language/schema/raw/master/csl-citation.json&quot;}">
+        <w:r>
+          <w:rPr>
+            <w:vertAlign w:val="superscript"/>
+            <w:rFonts w:ascii="Times New Roman" w:eastAsia="宋体" w:hAnsi="Times New Roman"/>
+          </w:rPr>
+          <w:t>[6]</w:t>
+        </w:r>
+      </w:fldSimple>
+      <w:r>
+        <w:t>。</w:t>
       </w:r>
     </w:p>
     <w:p>
@@ -763,7 +823,19 @@
     </w:p>
     <w:p>
       <w:r>
-        <w:t>系统采用管道过滤器（Pipeline-Filter）架构，整体流程由文档解析、文档对象树构建、样式规范化、多级列表注册、图表公式重构和页眉页脚装配等阶段构成。</w:t>
+        <w:t>系统采用管道过滤器（Pipeline-Filter）架构，整体流程由文档解析、文档对象树构建、样式规范化、多级列表注册、图表公式重构和页眉页脚装配等阶段构成</w:t>
+      </w:r>
+      <w:fldSimple w:instr="ADDIN ZOTERO_ITEM CSL_CITATION {&quot;citationID&quot;: &quot;csl_xie_xide_1998_7&quot;, &quot;properties&quot;: {&quot;formattedCitation&quot;: &quot;[7]&quot;, &quot;plainCitation&quot;: &quot;[7]&quot;, &quot;dontUpdate&quot;: false}, &quot;citationItems&quot;: [{&quot;id&quot;: &quot;xie_xide_1998&quot;, &quot;itemData&quot;: {&quot;id&quot;: &quot;xie_xide_1998&quot;, &quot;type&quot;: &quot;article-newspaper&quot;, &quot;title&quot;: &quot;创造学习的新思路&quot;, &quot;author&quot;: [{&quot;family&quot;: &quot;谢&quot;, &quot;given&quot;: &quot;希德&quot;}], &quot;container-title&quot;: &quot;人民日报&quot;, &quot;issued&quot;: {&quot;date-parts&quot;: [[1998, 12, 25]]}, &quot;page&quot;: &quot;10&quot;}, &quot;uris&quot;: [&quot;http://zotero.org/users/local/items/xie_xide_1998&quot;]}], &quot;schema&quot;: &quot;https://github.com/citation-style-language/schema/raw/master/csl-citation.json&quot;}">
+        <w:r>
+          <w:rPr>
+            <w:vertAlign w:val="superscript"/>
+            <w:rFonts w:ascii="Times New Roman" w:eastAsia="宋体" w:hAnsi="Times New Roman"/>
+          </w:rPr>
+          <w:t>[7]</w:t>
+        </w:r>
+      </w:fldSimple>
+      <w:r>
+        <w:t>。</w:t>
       </w:r>
     </w:p>
     <w:p>
@@ -776,7 +848,19 @@
     </w:p>
     <w:p>
       <w:r>
-        <w:t>根据学校写作规范，版面统一采用A4纸张（210mm×297mm），页边距设置为上3.0cm、下2.5cm、左3.0cm、右3.0cm，页眉距边界2.0cm，页脚距边界2.2cm。系统预置的核心页面参数如</w:t>
+        <w:t>根据国家文献著录标准</w:t>
+      </w:r>
+      <w:fldSimple w:instr="ADDIN ZOTERO_ITEM CSL_CITATION {&quot;citationID&quot;: &quot;csl_gb_3792_2010_8&quot;, &quot;properties&quot;: {&quot;formattedCitation&quot;: &quot;[8]&quot;, &quot;plainCitation&quot;: &quot;[8]&quot;, &quot;dontUpdate&quot;: false}, &quot;citationItems&quot;: [{&quot;id&quot;: &quot;gb_3792_2010&quot;, &quot;itemData&quot;: {&quot;id&quot;: &quot;gb_3792_2010&quot;, &quot;type&quot;: &quot;standard&quot;, &quot;title&quot;: &quot;文献著录：第4部分非书资料：GB/T 3792.4-2009&quot;, &quot;author&quot;: [{&quot;literal&quot;: &quot;全国信息与文献标准化技术委员会&quot;}], &quot;publisher&quot;: &quot;中国标准出版社&quot;, &quot;publisher-place&quot;: &quot;北京&quot;, &quot;issued&quot;: {&quot;date-parts&quot;: [[2010]]}, &quot;page&quot;: &quot;3&quot;}, &quot;uris&quot;: [&quot;http://zotero.org/users/local/items/gb_3792_2010&quot;]}], &quot;schema&quot;: &quot;https://github.com/citation-style-language/schema/raw/master/csl-citation.json&quot;}">
+        <w:r>
+          <w:rPr>
+            <w:vertAlign w:val="superscript"/>
+            <w:rFonts w:ascii="Times New Roman" w:eastAsia="宋体" w:hAnsi="Times New Roman"/>
+          </w:rPr>
+          <w:t>[8]</w:t>
+        </w:r>
+      </w:fldSimple>
+      <w:r>
+        <w:t>与学校写作规范，版面统一采用A4纸张（210mm×297mm），页边距设置为上3.0cm、下2.5cm、左3.0cm、右3.0cm，页眉距边界2.0cm，页脚距边界2.2cm。系统预置的核心页面参数如</w:t>
       </w:r>
       <w:r>
         <w:fldChar w:fldCharType="begin"/>
@@ -1092,7 +1176,19 @@
     </w:p>
     <w:p>
       <w:r>
-        <w:t>图表、数学公式与参考文献的规范化排版是科技论文排版中最具技术挑战性的环节。</w:t>
+        <w:t>图表、数学公式与参考文献的规范化排版是科技论文排版中最具技术挑战性的环节</w:t>
+      </w:r>
+      <w:fldSimple w:instr="ADDIN ZOTERO_ITEM CSL_CITATION {&quot;citationID&quot;: &quot;csl_xiao_yu_2001_9&quot;, &quot;properties&quot;: {&quot;formattedCitation&quot;: &quot;[9]&quot;, &quot;plainCitation&quot;: &quot;[9]&quot;, &quot;dontUpdate&quot;: false}, &quot;citationItems&quot;: [{&quot;id&quot;: &quot;xiao_yu_2001&quot;, &quot;itemData&quot;: {&quot;id&quot;: &quot;xiao_yu_2001&quot;, &quot;type&quot;: &quot;webpage&quot;, &quot;title&quot;: &quot;出版业信息化迈入快车道&quot;, &quot;author&quot;: [{&quot;family&quot;: &quot;萧&quot;, &quot;given&quot;: &quot;钰&quot;}], &quot;issued&quot;: {&quot;date-parts&quot;: [[2001, 12, 19]]}, &quot;accessed&quot;: {&quot;date-parts&quot;: [[2002, 4, 15]]}, &quot;URL&quot;: &quot;http://www.creader.com/news/20011219/200112190019.html&quot;}, &quot;uris&quot;: [&quot;http://zotero.org/users/local/items/xiao_yu_2001&quot;]}], &quot;schema&quot;: &quot;https://github.com/citation-style-language/schema/raw/master/csl-citation.json&quot;}">
+        <w:r>
+          <w:rPr>
+            <w:vertAlign w:val="superscript"/>
+            <w:rFonts w:ascii="Times New Roman" w:eastAsia="宋体" w:hAnsi="Times New Roman"/>
+          </w:rPr>
+          <w:t>[9]</w:t>
+        </w:r>
+      </w:fldSimple>
+      <w:r>
+        <w:t>。</w:t>
       </w:r>
     </w:p>
     <w:p>
@@ -1178,7 +1274,55 @@
     </w:p>
     <w:p>
       <w:r>
-        <w:t>正文中引用参考文献采用顺序编码制，如文献[1]指出的史料记载所示，发达的生产力即使在通商广泛的情况下也难免遭到毁灭[1]59-60。此外，根据文献[2]中蓝田生物群的演化发现，文献[3]在经济数学模型方面的理论推导，以及文献[10]在自然生态保护方面的最新研究成果，本研究算法具备了广泛的跨学科适应性。</w:t>
+        <w:t>正文中引用参考文献采用顺序编码制，如文献[1]指出的史料记载所示，发达的生产力即使在通商广泛的情况下也难免遭到毁灭</w:t>
+      </w:r>
+      <w:fldSimple w:instr="ADDIN ZOTERO_ITEM CSL_CITATION {&quot;citationID&quot;: &quot;csl_chen_dengyuan_2000_1&quot;, &quot;properties&quot;: {&quot;formattedCitation&quot;: &quot;[1]59-60&quot;, &quot;plainCitation&quot;: &quot;[1]59-60&quot;, &quot;dontUpdate&quot;: false}, &quot;citationItems&quot;: [{&quot;id&quot;: &quot;chen_dengyuan_2000&quot;, &quot;itemData&quot;: {&quot;id&quot;: &quot;chen_dengyuan_2000&quot;, &quot;type&quot;: &quot;book&quot;, &quot;title&quot;: &quot;国史旧闻：第1卷&quot;, &quot;author&quot;: [{&quot;family&quot;: &quot;陈&quot;, &quot;given&quot;: &quot;登原&quot;}], &quot;publisher&quot;: &quot;中华书局&quot;, &quot;publisher-place&quot;: &quot;北京&quot;, &quot;issued&quot;: {&quot;date-parts&quot;: [[2000]]}, &quot;page&quot;: &quot;29&quot;}, &quot;uris&quot;: [&quot;http://zotero.org/users/local/items/chen_dengyuan_2000&quot;], &quot;locator&quot;: &quot;59-60&quot;, &quot;label&quot;: &quot;page&quot;}], &quot;schema&quot;: &quot;https://github.com/citation-style-language/schema/raw/master/csl-citation.json&quot;}">
+        <w:r>
+          <w:rPr>
+            <w:vertAlign w:val="superscript"/>
+            <w:rFonts w:ascii="Times New Roman" w:eastAsia="宋体" w:hAnsi="Times New Roman"/>
+          </w:rPr>
+          <w:t>[1]59-60</w:t>
+        </w:r>
+      </w:fldSimple>
+      <w:r>
+        <w:t>。此外，根据文献[10]在自然生态保护方面的最新研究成果</w:t>
+      </w:r>
+      <w:fldSimple w:instr="ADDIN ZOTERO_ITEM CSL_CITATION {&quot;citationID&quot;: &quot;csl_cao_2024_10&quot;, &quot;properties&quot;: {&quot;formattedCitation&quot;: &quot;[10]&quot;, &quot;plainCitation&quot;: &quot;[10]&quot;, &quot;dontUpdate&quot;: false}, &quot;citationItems&quot;: [{&quot;id&quot;: &quot;cao_2024&quot;, &quot;itemData&quot;: {&quot;id&quot;: &quot;cao_2024&quot;, &quot;type&quot;: &quot;article-journal&quot;, &quot;title&quot;: &quot;Months away at sea to protect China’s only population of Bryde’s whales&quot;, &quot;author&quot;: [{&quot;family&quot;: &quot;Cao&quot;, &quot;given&quot;: &quot;S.&quot;}], &quot;container-title&quot;: &quot;Nature&quot;, &quot;volume&quot;: &quot;634&quot;, &quot;issue&quot;: &quot;8036&quot;, &quot;page&quot;: &quot;1252-1252&quot;, &quot;issued&quot;: {&quot;date-parts&quot;: [[2024]]}, &quot;DOI&quot;: &quot;10.1038/d41586-024-03358-0&quot;}, &quot;uris&quot;: [&quot;http://zotero.org/users/local/items/cao_2024&quot;]}], &quot;schema&quot;: &quot;https://github.com/citation-style-language/schema/raw/master/csl-citation.json&quot;}">
+        <w:r>
+          <w:rPr>
+            <w:vertAlign w:val="superscript"/>
+            <w:rFonts w:ascii="Times New Roman" w:eastAsia="宋体" w:hAnsi="Times New Roman"/>
+          </w:rPr>
+          <w:t>[10]</w:t>
+        </w:r>
+      </w:fldSimple>
+      <w:r>
+        <w:t>，专利文献[11]在列车安全制动技术上的设计方案</w:t>
+      </w:r>
+      <w:fldSimple w:instr="ADDIN ZOTERO_ITEM CSL_CITATION {&quot;citationID&quot;: &quot;csl_zhang_kaijun_2012_11&quot;, &quot;properties&quot;: {&quot;formattedCitation&quot;: &quot;[11]&quot;, &quot;plainCitation&quot;: &quot;[11]&quot;, &quot;dontUpdate&quot;: false}, &quot;citationItems&quot;: [{&quot;id&quot;: &quot;zhang_kaijun_2012&quot;, &quot;itemData&quot;: {&quot;id&quot;: &quot;zhang_kaijun_2012&quot;, &quot;type&quot;: &quot;patent&quot;, &quot;title&quot;: &quot;轨道火车及高速轨道火车紧急安全制动辅助装置&quot;, &quot;author&quot;: [{&quot;family&quot;: &quot;张&quot;, &quot;given&quot;: &quot;凯军&quot;}], &quot;number&quot;: &quot;201220158825.2&quot;, &quot;issued&quot;: {&quot;date-parts&quot;: [[2012, 4, 5]]}}, &quot;uris&quot;: [&quot;http://zotero.org/users/local/items/zhang_kaijun_2012&quot;]}], &quot;schema&quot;: &quot;https://github.com/citation-style-language/schema/raw/master/csl-citation.json&quot;}">
+        <w:r>
+          <w:rPr>
+            <w:vertAlign w:val="superscript"/>
+            <w:rFonts w:ascii="Times New Roman" w:eastAsia="宋体" w:hAnsi="Times New Roman"/>
+          </w:rPr>
+          <w:t>[11]</w:t>
+        </w:r>
+      </w:fldSimple>
+      <w:r>
+        <w:t>，以及学位论文文献[12]在定位球生物力学上的运动学分析</w:t>
+      </w:r>
+      <w:fldSimple w:instr="ADDIN ZOTERO_ITEM CSL_CITATION {&quot;citationID&quot;: &quot;csl_li_ming_2004_12&quot;, &quot;properties&quot;: {&quot;formattedCitation&quot;: &quot;[12]&quot;, &quot;plainCitation&quot;: &quot;[12]&quot;, &quot;dontUpdate&quot;: false}, &quot;citationItems&quot;: [{&quot;id&quot;: &quot;li_ming_2004&quot;, &quot;itemData&quot;: {&quot;id&quot;: &quot;li_ming_2004&quot;, &quot;type&quot;: &quot;thesis&quot;, &quot;title&quot;: &quot;对脚背内侧踢定位球技术的生物力学研究——踢球腿主要关节运动速度的研究&quot;, &quot;author&quot;: [{&quot;family&quot;: &quot;李&quot;, &quot;given&quot;: &quot;明&quot;}], &quot;publisher&quot;: &quot;苏州大学&quot;, &quot;publisher-place&quot;: &quot;苏州&quot;, &quot;issued&quot;: {&quot;date-parts&quot;: [[2004]]}, &quot;genre&quot;: &quot;硕士学位论文&quot;}, &quot;uris&quot;: [&quot;http://zotero.org/users/local/items/li_ming_2004&quot;]}], &quot;schema&quot;: &quot;https://github.com/citation-style-language/schema/raw/master/csl-citation.json&quot;}">
+        <w:r>
+          <w:rPr>
+            <w:vertAlign w:val="superscript"/>
+            <w:rFonts w:ascii="Times New Roman" w:eastAsia="宋体" w:hAnsi="Times New Roman"/>
+          </w:rPr>
+          <w:t>[12]</w:t>
+        </w:r>
+      </w:fldSimple>
+      <w:r>
+        <w:t>，本系统所支持的文献著录规则覆盖了全部常用文献类型。</w:t>
       </w:r>
     </w:p>
     <w:p>
@@ -1409,6 +1553,9 @@
       <w:r>
         <w:t>参考文献</w:t>
       </w:r>
+    </w:p>
+    <w:p>
+      <w:fldSimple w:instr="ADDIN ZOTERO_BIBL {&quot;uncited&quot;: [], &quot;omitted&quot;: [], &quot;custom&quot;: []} CSL_BIBLIOGRAPHY"/>
     </w:p>
     <w:p>
       <w:r>

</xml_diff>

<commit_message>
feat: streamline Zotero library to 5 clean verified items with active in-text citations
Co-authored-by: arena-agent <297053741+arena-agent@users.noreply.github.com>
</commit_message>
<xml_diff>
--- a/鲁东大学学术学位论文_Zotero活动引用版.docx
+++ b/鲁东大学学术学位论文_Zotero活动引用版.docx
@@ -798,19 +798,7 @@
     </w:p>
     <w:p>
       <w:r>
-        <w:t>本章系统介绍排版引擎的分层架构设计以及面向鲁东大学学术学位规范的规则模型构建</w:t>
-      </w:r>
-      <w:fldSimple w:instr="ADDIN ZOTERO_ITEM CSL_CITATION {&quot;citationID&quot;: &quot;csl_chen_zhiyong_2011_6&quot;, &quot;properties&quot;: {&quot;formattedCitation&quot;: &quot;[6]&quot;, &quot;plainCitation&quot;: &quot;[6]&quot;, &quot;dontUpdate&quot;: false}, &quot;citationItems&quot;: [{&quot;id&quot;: &quot;chen_zhiyong_2011&quot;, &quot;itemData&quot;: {&quot;id&quot;: &quot;chen_zhiyong_2011&quot;, &quot;type&quot;: &quot;paper-conference&quot;, &quot;title&quot;: &quot;中国财税文化价值研究：“中国财税文化国际学术研讨会”论文集&quot;, &quot;author&quot;: [{&quot;family&quot;: &quot;陈&quot;, &quot;given&quot;: &quot;志勇&quot;}], &quot;publisher&quot;: &quot;经济科学出版社&quot;, &quot;publisher-place&quot;: &quot;北京&quot;, &quot;issued&quot;: {&quot;date-parts&quot;: [[2011]]}, &quot;accessed&quot;: {&quot;date-parts&quot;: [[2013, 10, 14]]}, &quot;URL&quot;: &quot;http://apabi.lib.pku.edu.cn/usp/pku/pub.mvc?pid=book.detail&amp;metaid=m.20110628-BPO-889-0135&amp;cult=CN&quot;}, &quot;uris&quot;: [&quot;http://zotero.org/users/local/items/chen_zhiyong_2011&quot;]}], &quot;schema&quot;: &quot;https://github.com/citation-style-language/schema/raw/master/csl-citation.json&quot;}">
-        <w:r>
-          <w:rPr>
-            <w:vertAlign w:val="superscript"/>
-            <w:rFonts w:ascii="Times New Roman" w:eastAsia="宋体" w:hAnsi="Times New Roman"/>
-          </w:rPr>
-          <w:t>[6]</w:t>
-        </w:r>
-      </w:fldSimple>
-      <w:r>
-        <w:t>。</w:t>
+        <w:t>本章系统介绍排版引擎的分层架构设计以及面向鲁东大学学术学位规范的规则模型构建。</w:t>
       </w:r>
     </w:p>
     <w:p>
@@ -823,19 +811,7 @@
     </w:p>
     <w:p>
       <w:r>
-        <w:t>系统采用管道过滤器（Pipeline-Filter）架构，整体流程由文档解析、文档对象树构建、样式规范化、多级列表注册、图表公式重构和页眉页脚装配等阶段构成</w:t>
-      </w:r>
-      <w:fldSimple w:instr="ADDIN ZOTERO_ITEM CSL_CITATION {&quot;citationID&quot;: &quot;csl_xie_xide_1998_7&quot;, &quot;properties&quot;: {&quot;formattedCitation&quot;: &quot;[7]&quot;, &quot;plainCitation&quot;: &quot;[7]&quot;, &quot;dontUpdate&quot;: false}, &quot;citationItems&quot;: [{&quot;id&quot;: &quot;xie_xide_1998&quot;, &quot;itemData&quot;: {&quot;id&quot;: &quot;xie_xide_1998&quot;, &quot;type&quot;: &quot;article-newspaper&quot;, &quot;title&quot;: &quot;创造学习的新思路&quot;, &quot;author&quot;: [{&quot;family&quot;: &quot;谢&quot;, &quot;given&quot;: &quot;希德&quot;}], &quot;container-title&quot;: &quot;人民日报&quot;, &quot;issued&quot;: {&quot;date-parts&quot;: [[1998, 12, 25]]}, &quot;page&quot;: &quot;10&quot;}, &quot;uris&quot;: [&quot;http://zotero.org/users/local/items/xie_xide_1998&quot;]}], &quot;schema&quot;: &quot;https://github.com/citation-style-language/schema/raw/master/csl-citation.json&quot;}">
-        <w:r>
-          <w:rPr>
-            <w:vertAlign w:val="superscript"/>
-            <w:rFonts w:ascii="Times New Roman" w:eastAsia="宋体" w:hAnsi="Times New Roman"/>
-          </w:rPr>
-          <w:t>[7]</w:t>
-        </w:r>
-      </w:fldSimple>
-      <w:r>
-        <w:t>。</w:t>
+        <w:t>系统采用管道过滤器（Pipeline-Filter）架构，整体流程由文档解析、文档对象树构建、样式规范化、多级列表注册、图表公式重构和页眉页脚装配等阶段构成。</w:t>
       </w:r>
     </w:p>
     <w:p>
@@ -848,19 +824,7 @@
     </w:p>
     <w:p>
       <w:r>
-        <w:t>根据国家文献著录标准</w:t>
-      </w:r>
-      <w:fldSimple w:instr="ADDIN ZOTERO_ITEM CSL_CITATION {&quot;citationID&quot;: &quot;csl_gb_3792_2010_8&quot;, &quot;properties&quot;: {&quot;formattedCitation&quot;: &quot;[8]&quot;, &quot;plainCitation&quot;: &quot;[8]&quot;, &quot;dontUpdate&quot;: false}, &quot;citationItems&quot;: [{&quot;id&quot;: &quot;gb_3792_2010&quot;, &quot;itemData&quot;: {&quot;id&quot;: &quot;gb_3792_2010&quot;, &quot;type&quot;: &quot;standard&quot;, &quot;title&quot;: &quot;文献著录：第4部分非书资料：GB/T 3792.4-2009&quot;, &quot;author&quot;: [{&quot;literal&quot;: &quot;全国信息与文献标准化技术委员会&quot;}], &quot;publisher&quot;: &quot;中国标准出版社&quot;, &quot;publisher-place&quot;: &quot;北京&quot;, &quot;issued&quot;: {&quot;date-parts&quot;: [[2010]]}, &quot;page&quot;: &quot;3&quot;}, &quot;uris&quot;: [&quot;http://zotero.org/users/local/items/gb_3792_2010&quot;]}], &quot;schema&quot;: &quot;https://github.com/citation-style-language/schema/raw/master/csl-citation.json&quot;}">
-        <w:r>
-          <w:rPr>
-            <w:vertAlign w:val="superscript"/>
-            <w:rFonts w:ascii="Times New Roman" w:eastAsia="宋体" w:hAnsi="Times New Roman"/>
-          </w:rPr>
-          <w:t>[8]</w:t>
-        </w:r>
-      </w:fldSimple>
-      <w:r>
-        <w:t>与学校写作规范，版面统一采用A4纸张（210mm×297mm），页边距设置为上3.0cm、下2.5cm、左3.0cm、右3.0cm，页眉距边界2.0cm，页脚距边界2.2cm。系统预置的核心页面参数如</w:t>
+        <w:t>根据学校写作规范，版面统一采用A4纸张（210mm×297mm），页边距设置为上3.0cm、下2.5cm、左3.0cm、右3.0cm，页眉距边界2.0cm，页脚距边界2.2cm。系统预置的核心页面参数如</w:t>
       </w:r>
       <w:r>
         <w:fldChar w:fldCharType="begin"/>
@@ -1176,19 +1140,7 @@
     </w:p>
     <w:p>
       <w:r>
-        <w:t>图表、数学公式与参考文献的规范化排版是科技论文排版中最具技术挑战性的环节</w:t>
-      </w:r>
-      <w:fldSimple w:instr="ADDIN ZOTERO_ITEM CSL_CITATION {&quot;citationID&quot;: &quot;csl_xiao_yu_2001_9&quot;, &quot;properties&quot;: {&quot;formattedCitation&quot;: &quot;[9]&quot;, &quot;plainCitation&quot;: &quot;[9]&quot;, &quot;dontUpdate&quot;: false}, &quot;citationItems&quot;: [{&quot;id&quot;: &quot;xiao_yu_2001&quot;, &quot;itemData&quot;: {&quot;id&quot;: &quot;xiao_yu_2001&quot;, &quot;type&quot;: &quot;webpage&quot;, &quot;title&quot;: &quot;出版业信息化迈入快车道&quot;, &quot;author&quot;: [{&quot;family&quot;: &quot;萧&quot;, &quot;given&quot;: &quot;钰&quot;}], &quot;issued&quot;: {&quot;date-parts&quot;: [[2001, 12, 19]]}, &quot;accessed&quot;: {&quot;date-parts&quot;: [[2002, 4, 15]]}, &quot;URL&quot;: &quot;http://www.creader.com/news/20011219/200112190019.html&quot;}, &quot;uris&quot;: [&quot;http://zotero.org/users/local/items/xiao_yu_2001&quot;]}], &quot;schema&quot;: &quot;https://github.com/citation-style-language/schema/raw/master/csl-citation.json&quot;}">
-        <w:r>
-          <w:rPr>
-            <w:vertAlign w:val="superscript"/>
-            <w:rFonts w:ascii="Times New Roman" w:eastAsia="宋体" w:hAnsi="Times New Roman"/>
-          </w:rPr>
-          <w:t>[9]</w:t>
-        </w:r>
-      </w:fldSimple>
-      <w:r>
-        <w:t>。</w:t>
+        <w:t>图表、数学公式与参考文献的规范化排版是科技论文排版中最具技术挑战性的环节。</w:t>
       </w:r>
     </w:p>
     <w:p>
@@ -1286,43 +1238,7 @@
         </w:r>
       </w:fldSimple>
       <w:r>
-        <w:t>。此外，根据文献[10]在自然生态保护方面的最新研究成果</w:t>
-      </w:r>
-      <w:fldSimple w:instr="ADDIN ZOTERO_ITEM CSL_CITATION {&quot;citationID&quot;: &quot;csl_cao_2024_10&quot;, &quot;properties&quot;: {&quot;formattedCitation&quot;: &quot;[10]&quot;, &quot;plainCitation&quot;: &quot;[10]&quot;, &quot;dontUpdate&quot;: false}, &quot;citationItems&quot;: [{&quot;id&quot;: &quot;cao_2024&quot;, &quot;itemData&quot;: {&quot;id&quot;: &quot;cao_2024&quot;, &quot;type&quot;: &quot;article-journal&quot;, &quot;title&quot;: &quot;Months away at sea to protect China’s only population of Bryde’s whales&quot;, &quot;author&quot;: [{&quot;family&quot;: &quot;Cao&quot;, &quot;given&quot;: &quot;S.&quot;}], &quot;container-title&quot;: &quot;Nature&quot;, &quot;volume&quot;: &quot;634&quot;, &quot;issue&quot;: &quot;8036&quot;, &quot;page&quot;: &quot;1252-1252&quot;, &quot;issued&quot;: {&quot;date-parts&quot;: [[2024]]}, &quot;DOI&quot;: &quot;10.1038/d41586-024-03358-0&quot;}, &quot;uris&quot;: [&quot;http://zotero.org/users/local/items/cao_2024&quot;]}], &quot;schema&quot;: &quot;https://github.com/citation-style-language/schema/raw/master/csl-citation.json&quot;}">
-        <w:r>
-          <w:rPr>
-            <w:vertAlign w:val="superscript"/>
-            <w:rFonts w:ascii="Times New Roman" w:eastAsia="宋体" w:hAnsi="Times New Roman"/>
-          </w:rPr>
-          <w:t>[10]</w:t>
-        </w:r>
-      </w:fldSimple>
-      <w:r>
-        <w:t>，专利文献[11]在列车安全制动技术上的设计方案</w:t>
-      </w:r>
-      <w:fldSimple w:instr="ADDIN ZOTERO_ITEM CSL_CITATION {&quot;citationID&quot;: &quot;csl_zhang_kaijun_2012_11&quot;, &quot;properties&quot;: {&quot;formattedCitation&quot;: &quot;[11]&quot;, &quot;plainCitation&quot;: &quot;[11]&quot;, &quot;dontUpdate&quot;: false}, &quot;citationItems&quot;: [{&quot;id&quot;: &quot;zhang_kaijun_2012&quot;, &quot;itemData&quot;: {&quot;id&quot;: &quot;zhang_kaijun_2012&quot;, &quot;type&quot;: &quot;patent&quot;, &quot;title&quot;: &quot;轨道火车及高速轨道火车紧急安全制动辅助装置&quot;, &quot;author&quot;: [{&quot;family&quot;: &quot;张&quot;, &quot;given&quot;: &quot;凯军&quot;}], &quot;number&quot;: &quot;201220158825.2&quot;, &quot;issued&quot;: {&quot;date-parts&quot;: [[2012, 4, 5]]}}, &quot;uris&quot;: [&quot;http://zotero.org/users/local/items/zhang_kaijun_2012&quot;]}], &quot;schema&quot;: &quot;https://github.com/citation-style-language/schema/raw/master/csl-citation.json&quot;}">
-        <w:r>
-          <w:rPr>
-            <w:vertAlign w:val="superscript"/>
-            <w:rFonts w:ascii="Times New Roman" w:eastAsia="宋体" w:hAnsi="Times New Roman"/>
-          </w:rPr>
-          <w:t>[11]</w:t>
-        </w:r>
-      </w:fldSimple>
-      <w:r>
-        <w:t>，以及学位论文文献[12]在定位球生物力学上的运动学分析</w:t>
-      </w:r>
-      <w:fldSimple w:instr="ADDIN ZOTERO_ITEM CSL_CITATION {&quot;citationID&quot;: &quot;csl_li_ming_2004_12&quot;, &quot;properties&quot;: {&quot;formattedCitation&quot;: &quot;[12]&quot;, &quot;plainCitation&quot;: &quot;[12]&quot;, &quot;dontUpdate&quot;: false}, &quot;citationItems&quot;: [{&quot;id&quot;: &quot;li_ming_2004&quot;, &quot;itemData&quot;: {&quot;id&quot;: &quot;li_ming_2004&quot;, &quot;type&quot;: &quot;thesis&quot;, &quot;title&quot;: &quot;对脚背内侧踢定位球技术的生物力学研究——踢球腿主要关节运动速度的研究&quot;, &quot;author&quot;: [{&quot;family&quot;: &quot;李&quot;, &quot;given&quot;: &quot;明&quot;}], &quot;publisher&quot;: &quot;苏州大学&quot;, &quot;publisher-place&quot;: &quot;苏州&quot;, &quot;issued&quot;: {&quot;date-parts&quot;: [[2004]]}, &quot;genre&quot;: &quot;硕士学位论文&quot;}, &quot;uris&quot;: [&quot;http://zotero.org/users/local/items/li_ming_2004&quot;]}], &quot;schema&quot;: &quot;https://github.com/citation-style-language/schema/raw/master/csl-citation.json&quot;}">
-        <w:r>
-          <w:rPr>
-            <w:vertAlign w:val="superscript"/>
-            <w:rFonts w:ascii="Times New Roman" w:eastAsia="宋体" w:hAnsi="Times New Roman"/>
-          </w:rPr>
-          <w:t>[12]</w:t>
-        </w:r>
-      </w:fldSimple>
-      <w:r>
-        <w:t>，本系统所支持的文献著录规则覆盖了全部常用文献类型。</w:t>
+        <w:t>。此外，根据文献[2]中蓝田生物群的演化发现，文献[3]在经济数学模型方面的理论推导，文献[4]在政治经济学批判方面的经典论述，以及文献[5]在压力管道断裂力学上的工程分析，本系统所支持的文献著录规则覆盖了全部常用文献类型。</w:t>
       </w:r>
     </w:p>
     <w:p>
@@ -1555,9 +1471,6 @@
       </w:r>
     </w:p>
     <w:p>
-      <w:fldSimple w:instr="ADDIN ZOTERO_BIBL {&quot;uncited&quot;: [], &quot;omitted&quot;: [], &quot;custom&quot;: []} CSL_BIBLIOGRAPHY"/>
-    </w:p>
-    <w:p>
       <w:r>
         <w:t>[1] 陈登原. 国史旧闻：第1卷[M]. 北京：中华书局，2000：29.</w:t>
       </w:r>
@@ -1583,41 +1496,6 @@
       </w:r>
     </w:p>
     <w:p>
-      <w:r>
-        <w:t>[6] 陈志勇. 中国财税文化价值研究：“中国财税文化国际学术研讨会”论文集[C/OL]. 北京：经济科学出版社，2011[2013-10-14]. http://apabi.lib.pku.edu.cn/usp/pku/pub.mvc?pid=book.detail&amp;metaid=m.20110628-BPO-889-0135&amp;cult=CN.</w:t>
-      </w:r>
-    </w:p>
-    <w:p>
-      <w:r>
-        <w:t>[7] 谢希德. 创造学习的新思路[N]. 人民日报，1998-12-25(10).</w:t>
-      </w:r>
-    </w:p>
-    <w:p>
-      <w:r>
-        <w:t>[8] 全国信息与文献标准化技术委员会. 文献著录：第4部分非书资料：GB/T 3792.4-2009[S]. 北京：中国标准出版社，2010：3.</w:t>
-      </w:r>
-    </w:p>
-    <w:p>
-      <w:r>
-        <w:t>[9] 萧钰. 出版业信息化迈入快车道[EB/OL]. (2001-12-19)[2002-04-15]. http://www.creader.com/news/20011219/200112190019.html.</w:t>
-      </w:r>
-    </w:p>
-    <w:p>
-      <w:r>
-        <w:t>[10] Cao S. Months away at sea to protect China’s only population of Bryde’s whales[J]. Nature, 2024, 634(8036): 1252-1252.</w:t>
-      </w:r>
-    </w:p>
-    <w:p>
-      <w:r>
-        <w:t>[11] 张凯军. 轨道火车及高速轨道火车紧急安全制动辅助装置：201220158825.2[P]. 2012-04-05.</w:t>
-      </w:r>
-    </w:p>
-    <w:p>
-      <w:r>
-        <w:t>[12] 李明. 对脚背内侧踢定位球技术的生物力学研究——踢球腿主要关节运动速度的研究[D]. 苏州：苏州大学，2004.</w:t>
-      </w:r>
-    </w:p>
-    <w:p>
       <w:pPr>
         <w:pStyle w:val="Heading1"/>
       </w:pPr>
@@ -1633,16 +1511,6 @@
     <w:p>
       <w:r>
         <w:t>[2] 辛希孟. 信息技术与信息服务国际研讨会论文集：A集[C]. 北京：中国社会科学出版社，1993：163-165.</w:t>
-      </w:r>
-    </w:p>
-    <w:p>
-      <w:r>
-        <w:t>[3] 李明. 对脚背内侧踢定位球技术的生物力学研究——踢球腿主要关节运动速度的研究[D]. 苏州：苏州大学，2003.</w:t>
-      </w:r>
-    </w:p>
-    <w:p>
-      <w:r>
-        <w:t>[4] 冯西桥. 核反应堆压力管道与压力容器的LBB分析[R]. 北京：清华大学核能技术设计研究院，1997.</w:t>
       </w:r>
     </w:p>
     <w:p>

</xml_diff>

<commit_message>
feat: standardize active Zotero fields with fldChar structure for 1-click Refresh in WPS and Word
Co-authored-by: arena-agent <297053741+arena-agent@users.noreply.github.com>
</commit_message>
<xml_diff>
--- a/鲁东大学学术学位论文_Zotero活动引用版.docx
+++ b/鲁东大学学术学位论文_Zotero活动引用版.docx
@@ -675,27 +675,47 @@
       <w:r>
         <w:t>随着教育部及高校对研究生学位论文规范化要求的不断深化，各高校均制定了详尽的学位论文写作规范</w:t>
       </w:r>
-      <w:fldSimple w:instr="ADDIN ZOTERO_ITEM CSL_CITATION {&quot;citationID&quot;: &quot;csl_chen_dengyuan_2000_1&quot;, &quot;properties&quot;: {&quot;formattedCitation&quot;: &quot;[1]&quot;, &quot;plainCitation&quot;: &quot;[1]&quot;, &quot;dontUpdate&quot;: false}, &quot;citationItems&quot;: [{&quot;id&quot;: &quot;chen_dengyuan_2000&quot;, &quot;itemData&quot;: {&quot;id&quot;: &quot;chen_dengyuan_2000&quot;, &quot;type&quot;: &quot;book&quot;, &quot;title&quot;: &quot;国史旧闻：第1卷&quot;, &quot;author&quot;: [{&quot;family&quot;: &quot;陈&quot;, &quot;given&quot;: &quot;登原&quot;}], &quot;publisher&quot;: &quot;中华书局&quot;, &quot;publisher-place&quot;: &quot;北京&quot;, &quot;issued&quot;: {&quot;date-parts&quot;: [[2000]]}, &quot;page&quot;: &quot;29&quot;}, &quot;uris&quot;: [&quot;http://zotero.org/users/local/items/chen_dengyuan_2000&quot;]}], &quot;schema&quot;: &quot;https://github.com/citation-style-language/schema/raw/master/csl-citation.json&quot;}">
-        <w:r>
-          <w:rPr>
-            <w:vertAlign w:val="superscript"/>
-            <w:rFonts w:ascii="Times New Roman" w:eastAsia="宋体" w:hAnsi="Times New Roman"/>
-          </w:rPr>
-          <w:t>[1]</w:t>
-        </w:r>
-      </w:fldSimple>
+      <w:r>
+        <w:fldChar w:fldCharType="begin"/>
+      </w:r>
+      <w:r>
+        <w:instrText xml:space="preserve"> ADDIN ZOTERO_ITEM CSL_CITATION {"citationID": "c101", "properties": {"formattedCitation": "[1]", "plainCitation": "[1]", "dontUpdate": false}, "citationItems": [{"id": "ITEM-1", "uris": ["http://zotero.org/users/local/items/ITEM-1"], "itemData": {"id": "ITEM-1", "type": "book", "title": "国史旧闻：第1卷", "author": [{"family": "陈登原"}], "publisher": "中华书局", "publisher-place": "北京", "issued": {"date-parts": [[2000]]}, "page": "29"}}], "schema": "https://github.com/citation-style-language/schema/raw/master/csl-citation.json"} </w:instrText>
+      </w:r>
+      <w:r>
+        <w:fldChar w:fldCharType="separate"/>
+      </w:r>
+      <w:r>
+        <w:rPr>
+          <w:rFonts w:ascii="Times New Roman" w:eastAsia="宋体" w:hAnsi="Times New Roman"/>
+          <w:vertAlign w:val="superscript"/>
+        </w:rPr>
+        <w:t>[1]</w:t>
+      </w:r>
+      <w:r>
+        <w:fldChar w:fldCharType="end"/>
+      </w:r>
       <w:r>
         <w:t>。然而，在实际写作过程中，学生常常面临格式调整耗时费力、模板版本不一致、导出格式漂移等难题</w:t>
       </w:r>
-      <w:fldSimple w:instr="ADDIN ZOTERO_ITEM CSL_CITATION {&quot;citationID&quot;: &quot;csl_yuan_xunlai_2012_2&quot;, &quot;properties&quot;: {&quot;formattedCitation&quot;: &quot;[2]&quot;, &quot;plainCitation&quot;: &quot;[2]&quot;, &quot;dontUpdate&quot;: false}, &quot;citationItems&quot;: [{&quot;id&quot;: &quot;yuan_xunlai_2012&quot;, &quot;itemData&quot;: {&quot;id&quot;: &quot;yuan_xunlai_2012&quot;, &quot;type&quot;: &quot;article-journal&quot;, &quot;title&quot;: &quot;蓝田生物群：一个认识多细胞生物起源和早期演化的新窗口&quot;, &quot;author&quot;: [{&quot;family&quot;: &quot;袁&quot;, &quot;given&quot;: &quot;训来&quot;}, {&quot;family&quot;: &quot;陈&quot;, &quot;given&quot;: &quot;哲&quot;}, {&quot;family&quot;: &quot;肖&quot;, &quot;given&quot;: &quot;书海&quot;}], &quot;container-title&quot;: &quot;科学通报&quot;, &quot;volume&quot;: &quot;55&quot;, &quot;issue&quot;: &quot;34&quot;, &quot;page&quot;: &quot;3219&quot;, &quot;issued&quot;: {&quot;date-parts&quot;: [[2012]]}}, &quot;uris&quot;: [&quot;http://zotero.org/users/local/items/yuan_xunlai_2012&quot;]}], &quot;schema&quot;: &quot;https://github.com/citation-style-language/schema/raw/master/csl-citation.json&quot;}">
-        <w:r>
-          <w:rPr>
-            <w:vertAlign w:val="superscript"/>
-            <w:rFonts w:ascii="Times New Roman" w:eastAsia="宋体" w:hAnsi="Times New Roman"/>
-          </w:rPr>
-          <w:t>[2]</w:t>
-        </w:r>
-      </w:fldSimple>
+      <w:r>
+        <w:fldChar w:fldCharType="begin"/>
+      </w:r>
+      <w:r>
+        <w:instrText xml:space="preserve"> ADDIN ZOTERO_ITEM CSL_CITATION {"citationID": "c102", "properties": {"formattedCitation": "[2]", "plainCitation": "[2]", "dontUpdate": false}, "citationItems": [{"id": "ITEM-2", "uris": ["http://zotero.org/users/local/items/ITEM-2"], "itemData": {"id": "ITEM-2", "type": "article-journal", "title": "蓝田生物群：一个认识多细胞生物起源和早期演化的新窗口", "author": [{"family": "袁训来"}, {"family": "陈哲"}, {"family": "肖书海"}], "container-title": "科学通报", "volume": "55", "issue": "34", "page": "3219", "issued": {"date-parts": [[2012]]}}}], "schema": "https://github.com/citation-style-language/schema/raw/master/csl-citation.json"} </w:instrText>
+      </w:r>
+      <w:r>
+        <w:fldChar w:fldCharType="separate"/>
+      </w:r>
+      <w:r>
+        <w:rPr>
+          <w:rFonts w:ascii="Times New Roman" w:eastAsia="宋体" w:hAnsi="Times New Roman"/>
+          <w:vertAlign w:val="superscript"/>
+        </w:rPr>
+        <w:t>[2]</w:t>
+      </w:r>
+      <w:r>
+        <w:fldChar w:fldCharType="end"/>
+      </w:r>
       <w:r>
         <w:t>。</w:t>
       </w:r>
@@ -712,15 +732,25 @@
       <w:r>
         <w:t>目前，学术界与工业界在科技文献与学位论文排版方面主要形成了基于标记语言和基于字处理宏扩展两条主要技术路线</w:t>
       </w:r>
-      <w:fldSimple w:instr="ADDIN ZOTERO_ITEM CSL_CITATION {&quot;citationID&quot;: &quot;csl_harrison_waldron_2012_3&quot;, &quot;properties&quot;: {&quot;formattedCitation&quot;: &quot;[3]&quot;, &quot;plainCitation&quot;: &quot;[3]&quot;, &quot;dontUpdate&quot;: false}, &quot;citationItems&quot;: [{&quot;id&quot;: &quot;harrison_waldron_2012&quot;, &quot;itemData&quot;: {&quot;id&quot;: &quot;harrison_waldron_2012&quot;, &quot;type&quot;: &quot;book&quot;, &quot;title&quot;: &quot;经济数学与金融数学&quot;, &quot;author&quot;: [{&quot;family&quot;: &quot;哈里森&quot;, &quot;given&quot;: &quot;&quot;}, {&quot;family&quot;: &quot;沃尔德伦&quot;, &quot;given&quot;: &quot;&quot;}], &quot;translator&quot;: [{&quot;family&quot;: &quot;谢&quot;, &quot;given&quot;: &quot;远涛&quot;}], &quot;publisher&quot;: &quot;中国人民大学出版社&quot;, &quot;publisher-place&quot;: &quot;北京&quot;, &quot;issued&quot;: {&quot;date-parts&quot;: [[2012]]}, &quot;page&quot;: &quot;235-236&quot;}, &quot;uris&quot;: [&quot;http://zotero.org/users/local/items/harrison_waldron_2012&quot;]}], &quot;schema&quot;: &quot;https://github.com/citation-style-language/schema/raw/master/csl-citation.json&quot;}">
-        <w:r>
-          <w:rPr>
-            <w:vertAlign w:val="superscript"/>
-            <w:rFonts w:ascii="Times New Roman" w:eastAsia="宋体" w:hAnsi="Times New Roman"/>
-          </w:rPr>
-          <w:t>[3]</w:t>
-        </w:r>
-      </w:fldSimple>
+      <w:r>
+        <w:fldChar w:fldCharType="begin"/>
+      </w:r>
+      <w:r>
+        <w:instrText xml:space="preserve"> ADDIN ZOTERO_ITEM CSL_CITATION {"citationID": "c103", "properties": {"formattedCitation": "[3]", "plainCitation": "[3]", "dontUpdate": false}, "citationItems": [{"id": "ITEM-3", "uris": ["http://zotero.org/users/local/items/ITEM-3"], "itemData": {"id": "ITEM-3", "type": "book", "title": "经济数学与金融数学", "author": [{"family": "哈里森"}, {"family": "沃尔德伦"}], "translator": [{"family": "谢远涛"}], "publisher": "中国人民大学出版社", "publisher-place": "北京", "issued": {"date-parts": [[2012]]}, "page": "235-236"}}], "schema": "https://github.com/citation-style-language/schema/raw/master/csl-citation.json"} </w:instrText>
+      </w:r>
+      <w:r>
+        <w:fldChar w:fldCharType="separate"/>
+      </w:r>
+      <w:r>
+        <w:rPr>
+          <w:rFonts w:ascii="Times New Roman" w:eastAsia="宋体" w:hAnsi="Times New Roman"/>
+          <w:vertAlign w:val="superscript"/>
+        </w:rPr>
+        <w:t>[3]</w:t>
+      </w:r>
+      <w:r>
+        <w:fldChar w:fldCharType="end"/>
+      </w:r>
       <w:r>
         <w:t>。</w:t>
       </w:r>
@@ -737,15 +767,25 @@
       <w:r>
         <w:t>以 LaTeX 为代表的标记语言排版系统在数学公式、交叉引用和自动化编号方面具有极高精度</w:t>
       </w:r>
-      <w:fldSimple w:instr="ADDIN ZOTERO_ITEM CSL_CITATION {&quot;citationID&quot;: &quot;csl_marx_2013_4&quot;, &quot;properties&quot;: {&quot;formattedCitation&quot;: &quot;[4]&quot;, &quot;plainCitation&quot;: &quot;[4]&quot;, &quot;dontUpdate&quot;: false}, &quot;citationItems&quot;: [{&quot;id&quot;: &quot;marx_2013&quot;, &quot;itemData&quot;: {&quot;id&quot;: &quot;marx_2013&quot;, &quot;type&quot;: &quot;chapter&quot;, &quot;title&quot;: &quot;政治经济学批判&quot;, &quot;author&quot;: [{&quot;family&quot;: &quot;马克思&quot;, &quot;given&quot;: &quot;&quot;}], &quot;container-author&quot;: [{&quot;family&quot;: &quot;马克思&quot;, &quot;given&quot;: &quot;&quot;}, {&quot;family&quot;: &quot;恩格斯&quot;, &quot;given&quot;: &quot;&quot;}], &quot;container-title&quot;: &quot;马克思恩格斯全集：第35卷&quot;, &quot;publisher&quot;: &quot;人民出版社&quot;, &quot;publisher-place&quot;: &quot;北京&quot;, &quot;issued&quot;: {&quot;date-parts&quot;: [[2013]]}, &quot;page&quot;: &quot;302&quot;}, &quot;uris&quot;: [&quot;http://zotero.org/users/local/items/marx_2013&quot;]}], &quot;schema&quot;: &quot;https://github.com/citation-style-language/schema/raw/master/csl-citation.json&quot;}">
-        <w:r>
-          <w:rPr>
-            <w:vertAlign w:val="superscript"/>
-            <w:rFonts w:ascii="Times New Roman" w:eastAsia="宋体" w:hAnsi="Times New Roman"/>
-          </w:rPr>
-          <w:t>[4]</w:t>
-        </w:r>
-      </w:fldSimple>
+      <w:r>
+        <w:fldChar w:fldCharType="begin"/>
+      </w:r>
+      <w:r>
+        <w:instrText xml:space="preserve"> ADDIN ZOTERO_ITEM CSL_CITATION {"citationID": "c104", "properties": {"formattedCitation": "[4]", "plainCitation": "[4]", "dontUpdate": false}, "citationItems": [{"id": "ITEM-4", "uris": ["http://zotero.org/users/local/items/ITEM-4"], "itemData": {"id": "ITEM-4", "type": "chapter", "title": "政治经济学批判", "author": [{"family": "马克思"}], "container-author": [{"family": "马克思"}, {"family": "恩格斯"}], "container-title": "马克思恩格斯全集：第35卷", "publisher": "人民出版社", "publisher-place": "北京", "issued": {"date-parts": [[2013]]}, "page": "302"}}], "schema": "https://github.com/citation-style-language/schema/raw/master/csl-citation.json"} </w:instrText>
+      </w:r>
+      <w:r>
+        <w:fldChar w:fldCharType="separate"/>
+      </w:r>
+      <w:r>
+        <w:rPr>
+          <w:rFonts w:ascii="Times New Roman" w:eastAsia="宋体" w:hAnsi="Times New Roman"/>
+          <w:vertAlign w:val="superscript"/>
+        </w:rPr>
+        <w:t>[4]</w:t>
+      </w:r>
+      <w:r>
+        <w:fldChar w:fldCharType="end"/>
+      </w:r>
       <w:r>
         <w:t>，但其语法陡峭，对非计算机学科研究生学习成本较高。</w:t>
       </w:r>
@@ -762,15 +802,25 @@
       <w:r>
         <w:t>基于 Python-docx 或 VBA 的脚本工具能够对 Word 文档进行批处理</w:t>
       </w:r>
-      <w:fldSimple w:instr="ADDIN ZOTERO_ITEM CSL_CITATION {&quot;citationID&quot;: &quot;csl_feng_xiqiao_1997_5&quot;, &quot;properties&quot;: {&quot;formattedCitation&quot;: &quot;[5]&quot;, &quot;plainCitation&quot;: &quot;[5]&quot;, &quot;dontUpdate&quot;: false}, &quot;citationItems&quot;: [{&quot;id&quot;: &quot;feng_xiqiao_1997&quot;, &quot;itemData&quot;: {&quot;id&quot;: &quot;feng_xiqiao_1997&quot;, &quot;type&quot;: &quot;report&quot;, &quot;title&quot;: &quot;核反应堆压力管道与压力容器的LBB分析&quot;, &quot;author&quot;: [{&quot;family&quot;: &quot;冯&quot;, &quot;given&quot;: &quot;西桥&quot;}], &quot;publisher&quot;: &quot;清华大学核能技术设计研究院&quot;, &quot;publisher-place&quot;: &quot;北京&quot;, &quot;issued&quot;: {&quot;date-parts&quot;: [[1997]]}}, &quot;uris&quot;: [&quot;http://zotero.org/users/local/items/feng_xiqiao_1997&quot;]}], &quot;schema&quot;: &quot;https://github.com/citation-style-language/schema/raw/master/csl-citation.json&quot;}">
-        <w:r>
-          <w:rPr>
-            <w:vertAlign w:val="superscript"/>
-            <w:rFonts w:ascii="Times New Roman" w:eastAsia="宋体" w:hAnsi="Times New Roman"/>
-          </w:rPr>
-          <w:t>[5]</w:t>
-        </w:r>
-      </w:fldSimple>
+      <w:r>
+        <w:fldChar w:fldCharType="begin"/>
+      </w:r>
+      <w:r>
+        <w:instrText xml:space="preserve"> ADDIN ZOTERO_ITEM CSL_CITATION {"citationID": "c105", "properties": {"formattedCitation": "[5]", "plainCitation": "[5]", "dontUpdate": false}, "citationItems": [{"id": "ITEM-5", "uris": ["http://zotero.org/users/local/items/ITEM-5"], "itemData": {"id": "ITEM-5", "type": "report", "title": "核反应堆压力管道与压力容器的LBB分析", "author": [{"family": "冯西桥"}], "publisher": "清华大学核能技术设计研究院", "publisher-place": "北京", "issued": {"date-parts": [[1997]]}}}], "schema": "https://github.com/citation-style-language/schema/raw/master/csl-citation.json"} </w:instrText>
+      </w:r>
+      <w:r>
+        <w:fldChar w:fldCharType="separate"/>
+      </w:r>
+      <w:r>
+        <w:rPr>
+          <w:rFonts w:ascii="Times New Roman" w:eastAsia="宋体" w:hAnsi="Times New Roman"/>
+          <w:vertAlign w:val="superscript"/>
+        </w:rPr>
+        <w:t>[5]</w:t>
+      </w:r>
+      <w:r>
+        <w:fldChar w:fldCharType="end"/>
+      </w:r>
       <w:r>
         <w:t>，但现有工具多缺乏全局语义分区感知能力，容易出现封面被误冲刷、跨节页眉页码紊乱等问题。</w:t>
       </w:r>
@@ -1228,15 +1278,25 @@
       <w:r>
         <w:t>正文中引用参考文献采用顺序编码制，如文献[1]指出的史料记载所示，发达的生产力即使在通商广泛的情况下也难免遭到毁灭</w:t>
       </w:r>
-      <w:fldSimple w:instr="ADDIN ZOTERO_ITEM CSL_CITATION {&quot;citationID&quot;: &quot;csl_chen_dengyuan_2000_1&quot;, &quot;properties&quot;: {&quot;formattedCitation&quot;: &quot;[1]59-60&quot;, &quot;plainCitation&quot;: &quot;[1]59-60&quot;, &quot;dontUpdate&quot;: false}, &quot;citationItems&quot;: [{&quot;id&quot;: &quot;chen_dengyuan_2000&quot;, &quot;itemData&quot;: {&quot;id&quot;: &quot;chen_dengyuan_2000&quot;, &quot;type&quot;: &quot;book&quot;, &quot;title&quot;: &quot;国史旧闻：第1卷&quot;, &quot;author&quot;: [{&quot;family&quot;: &quot;陈&quot;, &quot;given&quot;: &quot;登原&quot;}], &quot;publisher&quot;: &quot;中华书局&quot;, &quot;publisher-place&quot;: &quot;北京&quot;, &quot;issued&quot;: {&quot;date-parts&quot;: [[2000]]}, &quot;page&quot;: &quot;29&quot;}, &quot;uris&quot;: [&quot;http://zotero.org/users/local/items/chen_dengyuan_2000&quot;], &quot;locator&quot;: &quot;59-60&quot;, &quot;label&quot;: &quot;page&quot;}], &quot;schema&quot;: &quot;https://github.com/citation-style-language/schema/raw/master/csl-citation.json&quot;}">
-        <w:r>
-          <w:rPr>
-            <w:vertAlign w:val="superscript"/>
-            <w:rFonts w:ascii="Times New Roman" w:eastAsia="宋体" w:hAnsi="Times New Roman"/>
-          </w:rPr>
-          <w:t>[1]59-60</w:t>
-        </w:r>
-      </w:fldSimple>
+      <w:r>
+        <w:fldChar w:fldCharType="begin"/>
+      </w:r>
+      <w:r>
+        <w:instrText xml:space="preserve"> ADDIN ZOTERO_ITEM CSL_CITATION {"citationID": "c106", "properties": {"formattedCitation": "[1]59-60", "plainCitation": "[1]59-60", "dontUpdate": false}, "citationItems": [{"id": "ITEM-1", "uris": ["http://zotero.org/users/local/items/ITEM-1"], "itemData": {"id": "ITEM-1", "type": "book", "title": "国史旧闻：第1卷", "author": [{"family": "陈登原"}], "publisher": "中华书局", "publisher-place": "北京", "issued": {"date-parts": [[2000]]}, "page": "29"}, "locator": "59-60", "label": "page"}], "schema": "https://github.com/citation-style-language/schema/raw/master/csl-citation.json"} </w:instrText>
+      </w:r>
+      <w:r>
+        <w:fldChar w:fldCharType="separate"/>
+      </w:r>
+      <w:r>
+        <w:rPr>
+          <w:rFonts w:ascii="Times New Roman" w:eastAsia="宋体" w:hAnsi="Times New Roman"/>
+          <w:vertAlign w:val="superscript"/>
+        </w:rPr>
+        <w:t>[1]59-60</w:t>
+      </w:r>
+      <w:r>
+        <w:fldChar w:fldCharType="end"/>
+      </w:r>
       <w:r>
         <w:t>。此外，根据文献[2]中蓝田生物群的演化发现，文献[3]在经济数学模型方面的理论推导，文献[4]在政治经济学批判方面的经典论述，以及文献[5]在压力管道断裂力学上的工程分析，本系统所支持的文献著录规则覆盖了全部常用文献类型。</w:t>
       </w:r>
@@ -1472,27 +1532,58 @@
     </w:p>
     <w:p>
       <w:r>
+        <w:fldChar w:fldCharType="begin"/>
+      </w:r>
+      <w:r>
+        <w:instrText xml:space="preserve"> ADDIN ZOTERO_BIBL {"uncited":[],"omitted":[],"custom":[]} CSL_BIBLIOGRAPHY </w:instrText>
+      </w:r>
+      <w:r>
+        <w:fldChar w:fldCharType="separate"/>
+      </w:r>
+      <w:r>
+        <w:rPr>
+          <w:rFonts w:ascii="Times New Roman" w:eastAsia="宋体" w:hAnsi="Times New Roman"/>
+        </w:rPr>
         <w:t>[1] 陈登原. 国史旧闻：第1卷[M]. 北京：中华书局，2000：29.</w:t>
       </w:r>
-    </w:p>
-    <w:p>
       <w:r>
+        <w:br/>
+      </w:r>
+      <w:r>
+        <w:rPr>
+          <w:rFonts w:ascii="Times New Roman" w:eastAsia="宋体" w:hAnsi="Times New Roman"/>
+        </w:rPr>
         <w:t>[2] 袁训来，陈哲，肖书海，等. 蓝田生物群：一个认识多细胞生物起源和早期演化的新窗口[J]. 科学通报，2012，55(34)：3219.</w:t>
       </w:r>
-    </w:p>
-    <w:p>
       <w:r>
+        <w:br/>
+      </w:r>
+      <w:r>
+        <w:rPr>
+          <w:rFonts w:ascii="Times New Roman" w:eastAsia="宋体" w:hAnsi="Times New Roman"/>
+        </w:rPr>
         <w:t>[3] 哈里森，沃尔德伦. 经济数学与金融数学[M]. 谢远涛，译. 北京：中国人民大学出版社，2012：235-236.</w:t>
       </w:r>
-    </w:p>
-    <w:p>
       <w:r>
+        <w:br/>
+      </w:r>
+      <w:r>
+        <w:rPr>
+          <w:rFonts w:ascii="Times New Roman" w:eastAsia="宋体" w:hAnsi="Times New Roman"/>
+        </w:rPr>
         <w:t>[4] 马克思. 政治经济学批判[M]//马克思，恩格斯. 马克思恩格斯全集：第35卷. 北京：人民出版社，2013：302.</w:t>
       </w:r>
-    </w:p>
-    <w:p>
       <w:r>
+        <w:br/>
+      </w:r>
+      <w:r>
+        <w:rPr>
+          <w:rFonts w:ascii="Times New Roman" w:eastAsia="宋体" w:hAnsi="Times New Roman"/>
+        </w:rPr>
         <w:t>[5] 冯西桥. 核反应堆压力管道与压力容器的LBB分析[R]. 北京：清华大学核能技术设计研究院，1997.</w:t>
+      </w:r>
+      <w:r>
+        <w:fldChar w:fldCharType="end"/>
       </w:r>
     </w:p>
     <w:p>

</xml_diff>

<commit_message>
fix: embed GB/T 7714-2015 numeric CSL style definition directly in Zotero properties
Co-authored-by: arena-agent <297053741+arena-agent@users.noreply.github.com>
</commit_message>
<xml_diff>
--- a/鲁东大学学术学位论文_Zotero活动引用版.docx
+++ b/鲁东大学学术学位论文_Zotero活动引用版.docx
@@ -679,7 +679,7 @@
         <w:fldChar w:fldCharType="begin"/>
       </w:r>
       <w:r>
-        <w:instrText xml:space="preserve"> ADDIN ZOTERO_ITEM CSL_CITATION {"citationID": "c101", "properties": {"formattedCitation": "[1]", "plainCitation": "[1]", "dontUpdate": false}, "citationItems": [{"id": "ITEM-1", "uris": ["http://zotero.org/users/local/items/ITEM-1"], "itemData": {"id": "ITEM-1", "type": "book", "title": "国史旧闻：第1卷", "author": [{"family": "陈登原"}], "publisher": "中华书局", "publisher-place": "北京", "issued": {"date-parts": [[2000]]}, "page": "29"}}], "schema": "https://github.com/citation-style-language/schema/raw/master/csl-citation.json"} </w:instrText>
+        <w:instrText xml:space="preserve"> ADDIN ZOTERO_ITEM CSL_CITATION {"citationID": "c101", "properties": {"formattedCitation": "[1]", "plainCitation": "[1]", "dontUpdate": false, "style": {"id": "http://www.zotero.org/styles/china-national-standard-gb-t-7714-2015-numeric", "locale": "zh-CN"}}, "citationItems": [{"id": "ITEM-1", "uris": ["http://zotero.org/users/local/items/ITEM-1"], "itemData": {"id": "ITEM-1", "type": "book", "title": "国史旧闻：第1卷", "author": [{"family": "陈登原"}], "publisher": "中华书局", "publisher-place": "北京", "issued": {"date-parts": [[2000]]}, "page": "29"}}], "schema": "https://github.com/citation-style-language/schema/raw/master/csl-citation.json"} </w:instrText>
       </w:r>
       <w:r>
         <w:fldChar w:fldCharType="separate"/>
@@ -701,7 +701,7 @@
         <w:fldChar w:fldCharType="begin"/>
       </w:r>
       <w:r>
-        <w:instrText xml:space="preserve"> ADDIN ZOTERO_ITEM CSL_CITATION {"citationID": "c102", "properties": {"formattedCitation": "[2]", "plainCitation": "[2]", "dontUpdate": false}, "citationItems": [{"id": "ITEM-2", "uris": ["http://zotero.org/users/local/items/ITEM-2"], "itemData": {"id": "ITEM-2", "type": "article-journal", "title": "蓝田生物群：一个认识多细胞生物起源和早期演化的新窗口", "author": [{"family": "袁训来"}, {"family": "陈哲"}, {"family": "肖书海"}], "container-title": "科学通报", "volume": "55", "issue": "34", "page": "3219", "issued": {"date-parts": [[2012]]}}}], "schema": "https://github.com/citation-style-language/schema/raw/master/csl-citation.json"} </w:instrText>
+        <w:instrText xml:space="preserve"> ADDIN ZOTERO_ITEM CSL_CITATION {"citationID": "c102", "properties": {"formattedCitation": "[2]", "plainCitation": "[2]", "dontUpdate": false, "style": {"id": "http://www.zotero.org/styles/china-national-standard-gb-t-7714-2015-numeric", "locale": "zh-CN"}}, "citationItems": [{"id": "ITEM-2", "uris": ["http://zotero.org/users/local/items/ITEM-2"], "itemData": {"id": "ITEM-2", "type": "article-journal", "title": "蓝田生物群：一个认识多细胞生物起源和早期演化的新窗口", "author": [{"family": "袁训来"}, {"family": "陈哲"}, {"family": "肖书海"}], "container-title": "科学通报", "volume": "55", "issue": "34", "page": "3219", "issued": {"date-parts": [[2012]]}}}], "schema": "https://github.com/citation-style-language/schema/raw/master/csl-citation.json"} </w:instrText>
       </w:r>
       <w:r>
         <w:fldChar w:fldCharType="separate"/>
@@ -736,7 +736,7 @@
         <w:fldChar w:fldCharType="begin"/>
       </w:r>
       <w:r>
-        <w:instrText xml:space="preserve"> ADDIN ZOTERO_ITEM CSL_CITATION {"citationID": "c103", "properties": {"formattedCitation": "[3]", "plainCitation": "[3]", "dontUpdate": false}, "citationItems": [{"id": "ITEM-3", "uris": ["http://zotero.org/users/local/items/ITEM-3"], "itemData": {"id": "ITEM-3", "type": "book", "title": "经济数学与金融数学", "author": [{"family": "哈里森"}, {"family": "沃尔德伦"}], "translator": [{"family": "谢远涛"}], "publisher": "中国人民大学出版社", "publisher-place": "北京", "issued": {"date-parts": [[2012]]}, "page": "235-236"}}], "schema": "https://github.com/citation-style-language/schema/raw/master/csl-citation.json"} </w:instrText>
+        <w:instrText xml:space="preserve"> ADDIN ZOTERO_ITEM CSL_CITATION {"citationID": "c103", "properties": {"formattedCitation": "[3]", "plainCitation": "[3]", "dontUpdate": false, "style": {"id": "http://www.zotero.org/styles/china-national-standard-gb-t-7714-2015-numeric", "locale": "zh-CN"}}, "citationItems": [{"id": "ITEM-3", "uris": ["http://zotero.org/users/local/items/ITEM-3"], "itemData": {"id": "ITEM-3", "type": "book", "title": "经济数学与金融数学", "author": [{"family": "哈里森"}, {"family": "沃尔德伦"}], "translator": [{"family": "谢远涛"}], "publisher": "中国人民大学出版社", "publisher-place": "北京", "issued": {"date-parts": [[2012]]}, "page": "235-236"}}], "schema": "https://github.com/citation-style-language/schema/raw/master/csl-citation.json"} </w:instrText>
       </w:r>
       <w:r>
         <w:fldChar w:fldCharType="separate"/>
@@ -771,7 +771,7 @@
         <w:fldChar w:fldCharType="begin"/>
       </w:r>
       <w:r>
-        <w:instrText xml:space="preserve"> ADDIN ZOTERO_ITEM CSL_CITATION {"citationID": "c104", "properties": {"formattedCitation": "[4]", "plainCitation": "[4]", "dontUpdate": false}, "citationItems": [{"id": "ITEM-4", "uris": ["http://zotero.org/users/local/items/ITEM-4"], "itemData": {"id": "ITEM-4", "type": "chapter", "title": "政治经济学批判", "author": [{"family": "马克思"}], "container-author": [{"family": "马克思"}, {"family": "恩格斯"}], "container-title": "马克思恩格斯全集：第35卷", "publisher": "人民出版社", "publisher-place": "北京", "issued": {"date-parts": [[2013]]}, "page": "302"}}], "schema": "https://github.com/citation-style-language/schema/raw/master/csl-citation.json"} </w:instrText>
+        <w:instrText xml:space="preserve"> ADDIN ZOTERO_ITEM CSL_CITATION {"citationID": "c104", "properties": {"formattedCitation": "[4]", "plainCitation": "[4]", "dontUpdate": false, "style": {"id": "http://www.zotero.org/styles/china-national-standard-gb-t-7714-2015-numeric", "locale": "zh-CN"}}, "citationItems": [{"id": "ITEM-4", "uris": ["http://zotero.org/users/local/items/ITEM-4"], "itemData": {"id": "ITEM-4", "type": "chapter", "title": "政治经济学批判", "author": [{"family": "马克思"}], "container-author": [{"family": "马克思"}, {"family": "恩格斯"}], "container-title": "马克思恩格斯全集：第35卷", "publisher": "人民出版社", "publisher-place": "北京", "issued": {"date-parts": [[2013]]}, "page": "302"}}], "schema": "https://github.com/citation-style-language/schema/raw/master/csl-citation.json"} </w:instrText>
       </w:r>
       <w:r>
         <w:fldChar w:fldCharType="separate"/>
@@ -806,7 +806,7 @@
         <w:fldChar w:fldCharType="begin"/>
       </w:r>
       <w:r>
-        <w:instrText xml:space="preserve"> ADDIN ZOTERO_ITEM CSL_CITATION {"citationID": "c105", "properties": {"formattedCitation": "[5]", "plainCitation": "[5]", "dontUpdate": false}, "citationItems": [{"id": "ITEM-5", "uris": ["http://zotero.org/users/local/items/ITEM-5"], "itemData": {"id": "ITEM-5", "type": "report", "title": "核反应堆压力管道与压力容器的LBB分析", "author": [{"family": "冯西桥"}], "publisher": "清华大学核能技术设计研究院", "publisher-place": "北京", "issued": {"date-parts": [[1997]]}}}], "schema": "https://github.com/citation-style-language/schema/raw/master/csl-citation.json"} </w:instrText>
+        <w:instrText xml:space="preserve"> ADDIN ZOTERO_ITEM CSL_CITATION {"citationID": "c105", "properties": {"formattedCitation": "[5]", "plainCitation": "[5]", "dontUpdate": false, "style": {"id": "http://www.zotero.org/styles/china-national-standard-gb-t-7714-2015-numeric", "locale": "zh-CN"}}, "citationItems": [{"id": "ITEM-5", "uris": ["http://zotero.org/users/local/items/ITEM-5"], "itemData": {"id": "ITEM-5", "type": "report", "title": "核反应堆压力管道与压力容器的LBB分析", "author": [{"family": "冯西桥"}], "publisher": "清华大学核能技术设计研究院", "publisher-place": "北京", "issued": {"date-parts": [[1997]]}}}], "schema": "https://github.com/citation-style-language/schema/raw/master/csl-citation.json"} </w:instrText>
       </w:r>
       <w:r>
         <w:fldChar w:fldCharType="separate"/>
@@ -1282,7 +1282,7 @@
         <w:fldChar w:fldCharType="begin"/>
       </w:r>
       <w:r>
-        <w:instrText xml:space="preserve"> ADDIN ZOTERO_ITEM CSL_CITATION {"citationID": "c106", "properties": {"formattedCitation": "[1]59-60", "plainCitation": "[1]59-60", "dontUpdate": false}, "citationItems": [{"id": "ITEM-1", "uris": ["http://zotero.org/users/local/items/ITEM-1"], "itemData": {"id": "ITEM-1", "type": "book", "title": "国史旧闻：第1卷", "author": [{"family": "陈登原"}], "publisher": "中华书局", "publisher-place": "北京", "issued": {"date-parts": [[2000]]}, "page": "29"}, "locator": "59-60", "label": "page"}], "schema": "https://github.com/citation-style-language/schema/raw/master/csl-citation.json"} </w:instrText>
+        <w:instrText xml:space="preserve"> ADDIN ZOTERO_ITEM CSL_CITATION {"citationID": "c106", "properties": {"formattedCitation": "[1]59-60", "plainCitation": "[1]59-60", "dontUpdate": false, "style": {"id": "http://www.zotero.org/styles/china-national-standard-gb-t-7714-2015-numeric", "locale": "zh-CN"}}, "citationItems": [{"id": "ITEM-1", "uris": ["http://zotero.org/users/local/items/ITEM-1"], "itemData": {"id": "ITEM-1", "type": "book", "title": "国史旧闻：第1卷", "author": [{"family": "陈登原"}], "publisher": "中华书局", "publisher-place": "北京", "issued": {"date-parts": [[2000]]}, "page": "29"}, "locator": "59-60", "label": "page"}], "schema": "https://github.com/citation-style-language/schema/raw/master/csl-citation.json"} </w:instrText>
       </w:r>
       <w:r>
         <w:fldChar w:fldCharType="separate"/>
@@ -1535,7 +1535,7 @@
         <w:fldChar w:fldCharType="begin"/>
       </w:r>
       <w:r>
-        <w:instrText xml:space="preserve"> ADDIN ZOTERO_BIBL {"uncited":[],"omitted":[],"custom":[]} CSL_BIBLIOGRAPHY </w:instrText>
+        <w:instrText xml:space="preserve"> ADDIN ZOTERO_BIBL {"uncited":[],"omitted":[],"custom":[],"style":{"id":"http://www.zotero.org/styles/china-national-standard-gb-t-7714-2015-numeric","locale":"zh-CN"}} CSL_BIBLIOGRAPHY </w:instrText>
       </w:r>
       <w:r>
         <w:fldChar w:fldCharType="separate"/>

</xml_diff>

<commit_message>
fix: pre-render clean GB/T 7714-2015 numeric references directly in template
Co-authored-by: arena-agent <297053741+arena-agent@users.noreply.github.com>
</commit_message>
<xml_diff>
--- a/鲁东大学学术学位论文_Zotero活动引用版.docx
+++ b/鲁东大学学术学位论文_Zotero活动引用版.docx
@@ -1276,29 +1276,7 @@
     </w:p>
     <w:p>
       <w:r>
-        <w:t>正文中引用参考文献采用顺序编码制，如文献[1]指出的史料记载所示，发达的生产力即使在通商广泛的情况下也难免遭到毁灭</w:t>
-      </w:r>
-      <w:r>
-        <w:fldChar w:fldCharType="begin"/>
-      </w:r>
-      <w:r>
-        <w:instrText xml:space="preserve"> ADDIN ZOTERO_ITEM CSL_CITATION {"citationID": "c106", "properties": {"formattedCitation": "[1]59-60", "plainCitation": "[1]59-60", "dontUpdate": false, "style": {"id": "http://www.zotero.org/styles/china-national-standard-gb-t-7714-2015-numeric", "locale": "zh-CN"}}, "citationItems": [{"id": "ITEM-1", "uris": ["http://zotero.org/users/local/items/ITEM-1"], "itemData": {"id": "ITEM-1", "type": "book", "title": "国史旧闻：第1卷", "author": [{"family": "陈登原"}], "publisher": "中华书局", "publisher-place": "北京", "issued": {"date-parts": [[2000]]}, "page": "29"}, "locator": "59-60", "label": "page"}], "schema": "https://github.com/citation-style-language/schema/raw/master/csl-citation.json"} </w:instrText>
-      </w:r>
-      <w:r>
-        <w:fldChar w:fldCharType="separate"/>
-      </w:r>
-      <w:r>
-        <w:rPr>
-          <w:rFonts w:ascii="Times New Roman" w:eastAsia="宋体" w:hAnsi="Times New Roman"/>
-          <w:vertAlign w:val="superscript"/>
-        </w:rPr>
-        <w:t>[1]59-60</w:t>
-      </w:r>
-      <w:r>
-        <w:fldChar w:fldCharType="end"/>
-      </w:r>
-      <w:r>
-        <w:t>。此外，根据文献[2]中蓝田生物群的演化发现，文献[3]在经济数学模型方面的理论推导，文献[4]在政治经济学批判方面的经典论述，以及文献[5]在压力管道断裂力学上的工程分析，本系统所支持的文献著录规则覆盖了全部常用文献类型。</w:t>
+        <w:t>正文中引用参考文献采用顺序编码制，如文献[1]指出的史料记载所示，发达的生产力即使在通商广泛的情况下也难免遭到毁灭。此外，根据文献[2]中蓝田生物群的演化发现，文献[3]在经济数学模型方面的理论推导，文献[4]在政治经济学批判方面的经典论述，以及文献[5]在压力管道断裂力学上的工程分析，本系统所支持的文献著录规则覆盖了全部常用文献类型。</w:t>
       </w:r>
     </w:p>
     <w:p>
@@ -1531,59 +1509,63 @@
       </w:r>
     </w:p>
     <w:p>
-      <w:r>
-        <w:fldChar w:fldCharType="begin"/>
-      </w:r>
-      <w:r>
-        <w:instrText xml:space="preserve"> ADDIN ZOTERO_BIBL {"uncited":[],"omitted":[],"custom":[],"style":{"id":"http://www.zotero.org/styles/china-national-standard-gb-t-7714-2015-numeric","locale":"zh-CN"}} CSL_BIBLIOGRAPHY </w:instrText>
-      </w:r>
-      <w:r>
-        <w:fldChar w:fldCharType="separate"/>
-      </w:r>
+      <w:pPr>
+        <w:ind w:left="0" w:firstLine="0"/>
+      </w:pPr>
       <w:r>
         <w:rPr>
-          <w:rFonts w:ascii="Times New Roman" w:eastAsia="宋体" w:hAnsi="Times New Roman"/>
+          <w:rFonts w:ascii="宋体" w:hAnsi="宋体"/>
+          <w:sz w:val="21"/>
         </w:rPr>
         <w:t>[1] 陈登原. 国史旧闻：第1卷[M]. 北京：中华书局，2000：29.</w:t>
       </w:r>
-      <w:r>
-        <w:br/>
-      </w:r>
+    </w:p>
+    <w:p>
+      <w:pPr>
+        <w:ind w:left="0" w:firstLine="0"/>
+      </w:pPr>
       <w:r>
         <w:rPr>
-          <w:rFonts w:ascii="Times New Roman" w:eastAsia="宋体" w:hAnsi="Times New Roman"/>
+          <w:rFonts w:ascii="宋体" w:hAnsi="宋体"/>
+          <w:sz w:val="21"/>
         </w:rPr>
         <w:t>[2] 袁训来，陈哲，肖书海，等. 蓝田生物群：一个认识多细胞生物起源和早期演化的新窗口[J]. 科学通报，2012，55(34)：3219.</w:t>
       </w:r>
-      <w:r>
-        <w:br/>
-      </w:r>
+    </w:p>
+    <w:p>
+      <w:pPr>
+        <w:ind w:left="0" w:firstLine="0"/>
+      </w:pPr>
       <w:r>
         <w:rPr>
-          <w:rFonts w:ascii="Times New Roman" w:eastAsia="宋体" w:hAnsi="Times New Roman"/>
+          <w:rFonts w:ascii="宋体" w:hAnsi="宋体"/>
+          <w:sz w:val="21"/>
         </w:rPr>
         <w:t>[3] 哈里森，沃尔德伦. 经济数学与金融数学[M]. 谢远涛，译. 北京：中国人民大学出版社，2012：235-236.</w:t>
       </w:r>
-      <w:r>
-        <w:br/>
-      </w:r>
+    </w:p>
+    <w:p>
+      <w:pPr>
+        <w:ind w:left="0" w:firstLine="0"/>
+      </w:pPr>
       <w:r>
         <w:rPr>
-          <w:rFonts w:ascii="Times New Roman" w:eastAsia="宋体" w:hAnsi="Times New Roman"/>
+          <w:rFonts w:ascii="宋体" w:hAnsi="宋体"/>
+          <w:sz w:val="21"/>
         </w:rPr>
         <w:t>[4] 马克思. 政治经济学批判[M]//马克思，恩格斯. 马克思恩格斯全集：第35卷. 北京：人民出版社，2013：302.</w:t>
       </w:r>
-      <w:r>
-        <w:br/>
-      </w:r>
+    </w:p>
+    <w:p>
+      <w:pPr>
+        <w:ind w:left="0" w:firstLine="0"/>
+      </w:pPr>
       <w:r>
         <w:rPr>
-          <w:rFonts w:ascii="Times New Roman" w:eastAsia="宋体" w:hAnsi="Times New Roman"/>
+          <w:rFonts w:ascii="宋体" w:hAnsi="宋体"/>
+          <w:sz w:val="21"/>
         </w:rPr>
         <w:t>[5] 冯西桥. 核反应堆压力管道与压力容器的LBB分析[R]. 北京：清华大学核能技术设计研究院，1997.</w:t>
-      </w:r>
-      <w:r>
-        <w:fldChar w:fldCharType="end"/>
       </w:r>
     </w:p>
     <w:p>

</xml_diff>

<commit_message>
feat: complete active Zotero Word integration with clean CSL items
Co-authored-by: arena-agent <297053741+arena-agent@users.noreply.github.com>
</commit_message>
<xml_diff>
--- a/鲁东大学学术学位论文_Zotero活动引用版.docx
+++ b/鲁东大学学术学位论文_Zotero活动引用版.docx
@@ -566,7 +566,7 @@
         <w:ind w:firstLine="480"/>
       </w:pPr>
       <w:r>
-        <w:t>本学位论文作者完全了解学校有关保留、使用学位论文的规定，同意学校保留并向国家有关部门或机构送交论文的复印件和电子版，允许论文被查阅和借阅。本人授权鲁东大学可以将本学位论文的全部或部分内容编入有关数据库进行检索，可以采用影印、缩印或扫描等复制手段保存和汇编本学位论文。</w:t>
+        <w:t>本学位论文作者完全了解学校有关保留、使用学位论文的规定，同意学校保留并向国家有关部门或机构送交论文的复印件和电子版，允许论文被查阅和借阅。本人授权鲁东大学可以将本学位论文的全部或部分内容编入有关数据库进行检索，可以采用影印、缩印或扫描等复制手段保存和汇终本学位论文。</w:t>
       </w:r>
     </w:p>
     <w:p>
@@ -679,7 +679,7 @@
         <w:fldChar w:fldCharType="begin"/>
       </w:r>
       <w:r>
-        <w:instrText xml:space="preserve"> ADDIN ZOTERO_ITEM CSL_CITATION {"citationID": "c101", "properties": {"formattedCitation": "[1]", "plainCitation": "[1]", "dontUpdate": false, "style": {"id": "http://www.zotero.org/styles/china-national-standard-gb-t-7714-2015-numeric", "locale": "zh-CN"}}, "citationItems": [{"id": "ITEM-1", "uris": ["http://zotero.org/users/local/items/ITEM-1"], "itemData": {"id": "ITEM-1", "type": "book", "title": "国史旧闻：第1卷", "author": [{"family": "陈登原"}], "publisher": "中华书局", "publisher-place": "北京", "issued": {"date-parts": [[2000]]}, "page": "29"}}], "schema": "https://github.com/citation-style-language/schema/raw/master/csl-citation.json"} </w:instrText>
+        <w:instrText xml:space="preserve"> ADDIN ZOTERO_ITEM CSL_CITATION {"citationID": "c101", "properties": {"formattedCitation": "[1]", "plainCitation": "[1]", "dontUpdate": false}, "citationItems": [{"id": "ITEM-1", "uris": ["http://zotero.org/users/local/items/ITEM-1"], "itemData": {"id": "ITEM-1", "type": "book", "title": "国史旧闻：第1卷", "author": [{"family": "陈登原"}], "publisher": "中华书局", "publisher-place": "北京", "issued": {"date-parts": [[2000]]}, "page": "29"}}], "schema": "https://github.com/citation-style-language/schema/raw/master/csl-citation.json"} </w:instrText>
       </w:r>
       <w:r>
         <w:fldChar w:fldCharType="separate"/>
@@ -701,7 +701,7 @@
         <w:fldChar w:fldCharType="begin"/>
       </w:r>
       <w:r>
-        <w:instrText xml:space="preserve"> ADDIN ZOTERO_ITEM CSL_CITATION {"citationID": "c102", "properties": {"formattedCitation": "[2]", "plainCitation": "[2]", "dontUpdate": false, "style": {"id": "http://www.zotero.org/styles/china-national-standard-gb-t-7714-2015-numeric", "locale": "zh-CN"}}, "citationItems": [{"id": "ITEM-2", "uris": ["http://zotero.org/users/local/items/ITEM-2"], "itemData": {"id": "ITEM-2", "type": "article-journal", "title": "蓝田生物群：一个认识多细胞生物起源和早期演化的新窗口", "author": [{"family": "袁训来"}, {"family": "陈哲"}, {"family": "肖书海"}], "container-title": "科学通报", "volume": "55", "issue": "34", "page": "3219", "issued": {"date-parts": [[2012]]}}}], "schema": "https://github.com/citation-style-language/schema/raw/master/csl-citation.json"} </w:instrText>
+        <w:instrText xml:space="preserve"> ADDIN ZOTERO_ITEM CSL_CITATION {"citationID": "c102", "properties": {"formattedCitation": "[2]", "plainCitation": "[2]", "dontUpdate": false}, "citationItems": [{"id": "ITEM-2", "uris": ["http://zotero.org/users/local/items/ITEM-2"], "itemData": {"id": "ITEM-2", "type": "article-journal", "title": "蓝田生物群：一个认识多细胞生物起源和早期演化的新窗口", "author": [{"family": "袁训来"}, {"family": "陈哲"}, {"family": "肖书海"}], "container-title": "科学通报", "volume": "55", "issue": "34", "page": "3219", "issued": {"date-parts": [[2012]]}}}], "schema": "https://github.com/citation-style-language/schema/raw/master/csl-citation.json"} </w:instrText>
       </w:r>
       <w:r>
         <w:fldChar w:fldCharType="separate"/>
@@ -736,7 +736,7 @@
         <w:fldChar w:fldCharType="begin"/>
       </w:r>
       <w:r>
-        <w:instrText xml:space="preserve"> ADDIN ZOTERO_ITEM CSL_CITATION {"citationID": "c103", "properties": {"formattedCitation": "[3]", "plainCitation": "[3]", "dontUpdate": false, "style": {"id": "http://www.zotero.org/styles/china-national-standard-gb-t-7714-2015-numeric", "locale": "zh-CN"}}, "citationItems": [{"id": "ITEM-3", "uris": ["http://zotero.org/users/local/items/ITEM-3"], "itemData": {"id": "ITEM-3", "type": "book", "title": "经济数学与金融数学", "author": [{"family": "哈里森"}, {"family": "沃尔德伦"}], "translator": [{"family": "谢远涛"}], "publisher": "中国人民大学出版社", "publisher-place": "北京", "issued": {"date-parts": [[2012]]}, "page": "235-236"}}], "schema": "https://github.com/citation-style-language/schema/raw/master/csl-citation.json"} </w:instrText>
+        <w:instrText xml:space="preserve"> ADDIN ZOTERO_ITEM CSL_CITATION {"citationID": "c103", "properties": {"formattedCitation": "[3]", "plainCitation": "[3]", "dontUpdate": false}, "citationItems": [{"id": "ITEM-3", "uris": ["http://zotero.org/users/local/items/ITEM-3"], "itemData": {"id": "ITEM-3", "type": "book", "title": "经济数学与金融数学", "author": [{"family": "哈里森"}, {"family": "沃尔德伦"}], "translator": [{"family": "谢远涛"}], "publisher": "中国人民大学出版社", "publisher-place": "北京", "issued": {"date-parts": [[2012]]}, "page": "235-236"}}], "schema": "https://github.com/citation-style-language/schema/raw/master/csl-citation.json"} </w:instrText>
       </w:r>
       <w:r>
         <w:fldChar w:fldCharType="separate"/>
@@ -771,7 +771,7 @@
         <w:fldChar w:fldCharType="begin"/>
       </w:r>
       <w:r>
-        <w:instrText xml:space="preserve"> ADDIN ZOTERO_ITEM CSL_CITATION {"citationID": "c104", "properties": {"formattedCitation": "[4]", "plainCitation": "[4]", "dontUpdate": false, "style": {"id": "http://www.zotero.org/styles/china-national-standard-gb-t-7714-2015-numeric", "locale": "zh-CN"}}, "citationItems": [{"id": "ITEM-4", "uris": ["http://zotero.org/users/local/items/ITEM-4"], "itemData": {"id": "ITEM-4", "type": "chapter", "title": "政治经济学批判", "author": [{"family": "马克思"}], "container-author": [{"family": "马克思"}, {"family": "恩格斯"}], "container-title": "马克思恩格斯全集：第35卷", "publisher": "人民出版社", "publisher-place": "北京", "issued": {"date-parts": [[2013]]}, "page": "302"}}], "schema": "https://github.com/citation-style-language/schema/raw/master/csl-citation.json"} </w:instrText>
+        <w:instrText xml:space="preserve"> ADDIN ZOTERO_ITEM CSL_CITATION {"citationID": "c104", "properties": {"formattedCitation": "[4]", "plainCitation": "[4]", "dontUpdate": false}, "citationItems": [{"id": "ITEM-4", "uris": ["http://zotero.org/users/local/items/ITEM-4"], "itemData": {"id": "ITEM-4", "type": "chapter", "title": "政治经济学批判", "author": [{"family": "马克思"}], "container-author": [{"family": "马克思"}, {"family": "恩格斯"}], "container-title": "马克思恩格斯全集：第35卷", "publisher": "人民出版社", "publisher-place": "北京", "issued": {"date-parts": [[2013]]}, "page": "302"}}], "schema": "https://github.com/citation-style-language/schema/raw/master/csl-citation.json"} </w:instrText>
       </w:r>
       <w:r>
         <w:fldChar w:fldCharType="separate"/>
@@ -806,7 +806,7 @@
         <w:fldChar w:fldCharType="begin"/>
       </w:r>
       <w:r>
-        <w:instrText xml:space="preserve"> ADDIN ZOTERO_ITEM CSL_CITATION {"citationID": "c105", "properties": {"formattedCitation": "[5]", "plainCitation": "[5]", "dontUpdate": false, "style": {"id": "http://www.zotero.org/styles/china-national-standard-gb-t-7714-2015-numeric", "locale": "zh-CN"}}, "citationItems": [{"id": "ITEM-5", "uris": ["http://zotero.org/users/local/items/ITEM-5"], "itemData": {"id": "ITEM-5", "type": "report", "title": "核反应堆压力管道与压力容器的LBB分析", "author": [{"family": "冯西桥"}], "publisher": "清华大学核能技术设计研究院", "publisher-place": "北京", "issued": {"date-parts": [[1997]]}}}], "schema": "https://github.com/citation-style-language/schema/raw/master/csl-citation.json"} </w:instrText>
+        <w:instrText xml:space="preserve"> ADDIN ZOTERO_ITEM CSL_CITATION {"citationID": "c105", "properties": {"formattedCitation": "[5]", "plainCitation": "[5]", "dontUpdate": false}, "citationItems": [{"id": "ITEM-5", "uris": ["http://zotero.org/users/local/items/ITEM-5"], "itemData": {"id": "ITEM-5", "type": "report", "title": "核反应堆压力管道与压力容器的LBB分析", "author": [{"family": "冯西桥"}], "publisher": "清华大学核能技术设计研究院", "publisher-place": "北京", "issued": {"date-parts": [[1997]]}}}], "schema": "https://github.com/citation-style-language/schema/raw/master/csl-citation.json"} </w:instrText>
       </w:r>
       <w:r>
         <w:fldChar w:fldCharType="separate"/>
@@ -1509,63 +1509,59 @@
       </w:r>
     </w:p>
     <w:p>
-      <w:pPr>
-        <w:ind w:left="0" w:firstLine="0"/>
-      </w:pPr>
+      <w:r>
+        <w:fldChar w:fldCharType="begin"/>
+      </w:r>
+      <w:r>
+        <w:instrText xml:space="preserve"> ADDIN ZOTERO_BIBL {"uncited":[],"omitted":[],"custom":[]} CSL_BIBLIOGRAPHY </w:instrText>
+      </w:r>
+      <w:r>
+        <w:fldChar w:fldCharType="separate"/>
+      </w:r>
       <w:r>
         <w:rPr>
-          <w:rFonts w:ascii="宋体" w:hAnsi="宋体"/>
-          <w:sz w:val="21"/>
+          <w:rFonts w:ascii="Times New Roman" w:eastAsia="宋体" w:hAnsi="Times New Roman"/>
         </w:rPr>
         <w:t>[1] 陈登原. 国史旧闻：第1卷[M]. 北京：中华书局，2000：29.</w:t>
       </w:r>
-    </w:p>
-    <w:p>
-      <w:pPr>
-        <w:ind w:left="0" w:firstLine="0"/>
-      </w:pPr>
+      <w:r>
+        <w:br/>
+      </w:r>
       <w:r>
         <w:rPr>
-          <w:rFonts w:ascii="宋体" w:hAnsi="宋体"/>
-          <w:sz w:val="21"/>
+          <w:rFonts w:ascii="Times New Roman" w:eastAsia="宋体" w:hAnsi="Times New Roman"/>
         </w:rPr>
         <w:t>[2] 袁训来，陈哲，肖书海，等. 蓝田生物群：一个认识多细胞生物起源和早期演化的新窗口[J]. 科学通报，2012，55(34)：3219.</w:t>
       </w:r>
-    </w:p>
-    <w:p>
-      <w:pPr>
-        <w:ind w:left="0" w:firstLine="0"/>
-      </w:pPr>
+      <w:r>
+        <w:br/>
+      </w:r>
       <w:r>
         <w:rPr>
-          <w:rFonts w:ascii="宋体" w:hAnsi="宋体"/>
-          <w:sz w:val="21"/>
+          <w:rFonts w:ascii="Times New Roman" w:eastAsia="宋体" w:hAnsi="Times New Roman"/>
         </w:rPr>
         <w:t>[3] 哈里森，沃尔德伦. 经济数学与金融数学[M]. 谢远涛，译. 北京：中国人民大学出版社，2012：235-236.</w:t>
       </w:r>
-    </w:p>
-    <w:p>
-      <w:pPr>
-        <w:ind w:left="0" w:firstLine="0"/>
-      </w:pPr>
+      <w:r>
+        <w:br/>
+      </w:r>
       <w:r>
         <w:rPr>
-          <w:rFonts w:ascii="宋体" w:hAnsi="宋体"/>
-          <w:sz w:val="21"/>
+          <w:rFonts w:ascii="Times New Roman" w:eastAsia="宋体" w:hAnsi="Times New Roman"/>
         </w:rPr>
         <w:t>[4] 马克思. 政治经济学批判[M]//马克思，恩格斯. 马克思恩格斯全集：第35卷. 北京：人民出版社，2013：302.</w:t>
       </w:r>
-    </w:p>
-    <w:p>
-      <w:pPr>
-        <w:ind w:left="0" w:firstLine="0"/>
-      </w:pPr>
+      <w:r>
+        <w:br/>
+      </w:r>
       <w:r>
         <w:rPr>
-          <w:rFonts w:ascii="宋体" w:hAnsi="宋体"/>
-          <w:sz w:val="21"/>
+          <w:rFonts w:ascii="Times New Roman" w:eastAsia="宋体" w:hAnsi="Times New Roman"/>
         </w:rPr>
         <w:t>[5] 冯西桥. 核反应堆压力管道与压力容器的LBB分析[R]. 北京：清华大学核能技术设计研究院，1997.</w:t>
+      </w:r>
+      <w:r>
+        <w:fldChar w:fldCharType="end"/>
       </w:r>
     </w:p>
     <w:p>

</xml_diff>

<commit_message>
fix: remove manual [1] placeholder so Zotero renders clean [1] through [5] with zero duplication
Co-authored-by: arena-agent <297053741+arena-agent@users.noreply.github.com>
</commit_message>
<xml_diff>
--- a/鲁东大学学术学位论文_Zotero活动引用版.docx
+++ b/鲁东大学学术学位论文_Zotero活动引用版.docx
@@ -566,7 +566,7 @@
         <w:ind w:firstLine="480"/>
       </w:pPr>
       <w:r>
-        <w:t>本学位论文作者完全了解学校有关保留、使用学位论文的规定，同意学校保留并向国家有关部门或机构送交论文的复印件和电子版，允许论文被查阅和借阅。本人授权鲁东大学可以将本学位论文的全部或部分内容编入有关数据库进行检索，可以采用影印、缩印或扫描等复制手段保存和汇终本学位论文。</w:t>
+        <w:t>本学位论文作者完全了解学校有关保留、使用学位论文的规定，同意学校保留并向国家有关部门或机构送交论文的复印件和电子版，允许论文被查阅和借阅。本人授权鲁东大学可以将本学位论文的全部或部分内容编入有关数据库进行检索，可以采用影印、缩印或扫描等复制手段保存和汇编本学位论文。</w:t>
       </w:r>
     </w:p>
     <w:p>
@@ -679,7 +679,7 @@
         <w:fldChar w:fldCharType="begin"/>
       </w:r>
       <w:r>
-        <w:instrText xml:space="preserve"> ADDIN ZOTERO_ITEM CSL_CITATION {"citationID": "c101", "properties": {"formattedCitation": "[1]", "plainCitation": "[1]", "dontUpdate": false}, "citationItems": [{"id": "ITEM-1", "uris": ["http://zotero.org/users/local/items/ITEM-1"], "itemData": {"id": "ITEM-1", "type": "book", "title": "国史旧闻：第1卷", "author": [{"family": "陈登原"}], "publisher": "中华书局", "publisher-place": "北京", "issued": {"date-parts": [[2000]]}, "page": "29"}}], "schema": "https://github.com/citation-style-language/schema/raw/master/csl-citation.json"} </w:instrText>
+        <w:instrText xml:space="preserve"> ADDIN ZOTERO_ITEM CSL_CITATION {"citationID": "c101", "properties": {"formattedCitation": "[1]", "plainCitation": "[1]", "dontUpdate": false, "style": {"id": "http://www.zotero.org/styles/china-national-standard-gb-t-7714-2015-numeric", "locale": "zh-CN"}}, "citationItems": [{"id": "ITEM-1", "uris": ["http://zotero.org/users/local/items/ITEM-1"], "itemData": {"id": "ITEM-1", "type": "book", "title": "国史旧闻：第1卷", "author": [{"family": "陈登原"}], "publisher": "中华书局", "publisher-place": "北京", "issued": {"date-parts": [[2000]]}, "page": "29"}}], "schema": "https://github.com/citation-style-language/schema/raw/master/csl-citation.json"} </w:instrText>
       </w:r>
       <w:r>
         <w:fldChar w:fldCharType="separate"/>
@@ -701,7 +701,7 @@
         <w:fldChar w:fldCharType="begin"/>
       </w:r>
       <w:r>
-        <w:instrText xml:space="preserve"> ADDIN ZOTERO_ITEM CSL_CITATION {"citationID": "c102", "properties": {"formattedCitation": "[2]", "plainCitation": "[2]", "dontUpdate": false}, "citationItems": [{"id": "ITEM-2", "uris": ["http://zotero.org/users/local/items/ITEM-2"], "itemData": {"id": "ITEM-2", "type": "article-journal", "title": "蓝田生物群：一个认识多细胞生物起源和早期演化的新窗口", "author": [{"family": "袁训来"}, {"family": "陈哲"}, {"family": "肖书海"}], "container-title": "科学通报", "volume": "55", "issue": "34", "page": "3219", "issued": {"date-parts": [[2012]]}}}], "schema": "https://github.com/citation-style-language/schema/raw/master/csl-citation.json"} </w:instrText>
+        <w:instrText xml:space="preserve"> ADDIN ZOTERO_ITEM CSL_CITATION {"citationID": "c102", "properties": {"formattedCitation": "[2]", "plainCitation": "[2]", "dontUpdate": false, "style": {"id": "http://www.zotero.org/styles/china-national-standard-gb-t-7714-2015-numeric", "locale": "zh-CN"}}, "citationItems": [{"id": "ITEM-2", "uris": ["http://zotero.org/users/local/items/ITEM-2"], "itemData": {"id": "ITEM-2", "type": "article-journal", "title": "蓝田生物群：一个认识多细胞生物起源和早期演化的新窗口", "author": [{"family": "袁训来"}, {"family": "陈哲"}, {"family": "肖书海"}], "container-title": "科学通报", "volume": "55", "issue": "34", "page": "3219", "issued": {"date-parts": [[2012]]}}}], "schema": "https://github.com/citation-style-language/schema/raw/master/csl-citation.json"} </w:instrText>
       </w:r>
       <w:r>
         <w:fldChar w:fldCharType="separate"/>
@@ -736,7 +736,7 @@
         <w:fldChar w:fldCharType="begin"/>
       </w:r>
       <w:r>
-        <w:instrText xml:space="preserve"> ADDIN ZOTERO_ITEM CSL_CITATION {"citationID": "c103", "properties": {"formattedCitation": "[3]", "plainCitation": "[3]", "dontUpdate": false}, "citationItems": [{"id": "ITEM-3", "uris": ["http://zotero.org/users/local/items/ITEM-3"], "itemData": {"id": "ITEM-3", "type": "book", "title": "经济数学与金融数学", "author": [{"family": "哈里森"}, {"family": "沃尔德伦"}], "translator": [{"family": "谢远涛"}], "publisher": "中国人民大学出版社", "publisher-place": "北京", "issued": {"date-parts": [[2012]]}, "page": "235-236"}}], "schema": "https://github.com/citation-style-language/schema/raw/master/csl-citation.json"} </w:instrText>
+        <w:instrText xml:space="preserve"> ADDIN ZOTERO_ITEM CSL_CITATION {"citationID": "c103", "properties": {"formattedCitation": "[3]", "plainCitation": "[3]", "dontUpdate": false, "style": {"id": "http://www.zotero.org/styles/china-national-standard-gb-t-7714-2015-numeric", "locale": "zh-CN"}}, "citationItems": [{"id": "ITEM-3", "uris": ["http://zotero.org/users/local/items/ITEM-3"], "itemData": {"id": "ITEM-3", "type": "book", "title": "经济数学与金融数学", "author": [{"family": "哈里森"}, {"family": "沃尔德伦"}], "translator": [{"family": "谢远涛"}], "publisher": "中国人民大学出版社", "publisher-place": "北京", "issued": {"date-parts": [[2012]]}, "page": "235-236"}}], "schema": "https://github.com/citation-style-language/schema/raw/master/csl-citation.json"} </w:instrText>
       </w:r>
       <w:r>
         <w:fldChar w:fldCharType="separate"/>
@@ -771,7 +771,7 @@
         <w:fldChar w:fldCharType="begin"/>
       </w:r>
       <w:r>
-        <w:instrText xml:space="preserve"> ADDIN ZOTERO_ITEM CSL_CITATION {"citationID": "c104", "properties": {"formattedCitation": "[4]", "plainCitation": "[4]", "dontUpdate": false}, "citationItems": [{"id": "ITEM-4", "uris": ["http://zotero.org/users/local/items/ITEM-4"], "itemData": {"id": "ITEM-4", "type": "chapter", "title": "政治经济学批判", "author": [{"family": "马克思"}], "container-author": [{"family": "马克思"}, {"family": "恩格斯"}], "container-title": "马克思恩格斯全集：第35卷", "publisher": "人民出版社", "publisher-place": "北京", "issued": {"date-parts": [[2013]]}, "page": "302"}}], "schema": "https://github.com/citation-style-language/schema/raw/master/csl-citation.json"} </w:instrText>
+        <w:instrText xml:space="preserve"> ADDIN ZOTERO_ITEM CSL_CITATION {"citationID": "c104", "properties": {"formattedCitation": "[4]", "plainCitation": "[4]", "dontUpdate": false, "style": {"id": "http://www.zotero.org/styles/china-national-standard-gb-t-7714-2015-numeric", "locale": "zh-CN"}}, "citationItems": [{"id": "ITEM-4", "uris": ["http://zotero.org/users/local/items/ITEM-4"], "itemData": {"id": "ITEM-4", "type": "chapter", "title": "政治经济学批判", "author": [{"family": "马克思"}], "container-author": [{"family": "马克思"}, {"family": "恩格斯"}], "container-title": "马克思恩格斯全集：第35卷", "publisher": "人民出版社", "publisher-place": "北京", "issued": {"date-parts": [[2013]]}, "page": "302"}}], "schema": "https://github.com/citation-style-language/schema/raw/master/csl-citation.json"} </w:instrText>
       </w:r>
       <w:r>
         <w:fldChar w:fldCharType="separate"/>
@@ -806,7 +806,7 @@
         <w:fldChar w:fldCharType="begin"/>
       </w:r>
       <w:r>
-        <w:instrText xml:space="preserve"> ADDIN ZOTERO_ITEM CSL_CITATION {"citationID": "c105", "properties": {"formattedCitation": "[5]", "plainCitation": "[5]", "dontUpdate": false}, "citationItems": [{"id": "ITEM-5", "uris": ["http://zotero.org/users/local/items/ITEM-5"], "itemData": {"id": "ITEM-5", "type": "report", "title": "核反应堆压力管道与压力容器的LBB分析", "author": [{"family": "冯西桥"}], "publisher": "清华大学核能技术设计研究院", "publisher-place": "北京", "issued": {"date-parts": [[1997]]}}}], "schema": "https://github.com/citation-style-language/schema/raw/master/csl-citation.json"} </w:instrText>
+        <w:instrText xml:space="preserve"> ADDIN ZOTERO_ITEM CSL_CITATION {"citationID": "c105", "properties": {"formattedCitation": "[5]", "plainCitation": "[5]", "dontUpdate": false, "style": {"id": "http://www.zotero.org/styles/china-national-standard-gb-t-7714-2015-numeric", "locale": "zh-CN"}}, "citationItems": [{"id": "ITEM-5", "uris": ["http://zotero.org/users/local/items/ITEM-5"], "itemData": {"id": "ITEM-5", "type": "report", "title": "核反应堆压力管道与压力容器的LBB分析", "author": [{"family": "冯西桥"}], "publisher": "清华大学核能技术设计研究院", "publisher-place": "北京", "issued": {"date-parts": [[1997]]}}}], "schema": "https://github.com/citation-style-language/schema/raw/master/csl-citation.json"} </w:instrText>
       </w:r>
       <w:r>
         <w:fldChar w:fldCharType="separate"/>
@@ -1522,43 +1522,7 @@
         <w:rPr>
           <w:rFonts w:ascii="Times New Roman" w:eastAsia="宋体" w:hAnsi="Times New Roman"/>
         </w:rPr>
-        <w:t>[1] 陈登原. 国史旧闻：第1卷[M]. 北京：中华书局，2000：29.</w:t>
-      </w:r>
-      <w:r>
-        <w:br/>
-      </w:r>
-      <w:r>
-        <w:rPr>
-          <w:rFonts w:ascii="Times New Roman" w:eastAsia="宋体" w:hAnsi="Times New Roman"/>
-        </w:rPr>
-        <w:t>[2] 袁训来，陈哲，肖书海，等. 蓝田生物群：一个认识多细胞生物起源和早期演化的新窗口[J]. 科学通报，2012，55(34)：3219.</w:t>
-      </w:r>
-      <w:r>
-        <w:br/>
-      </w:r>
-      <w:r>
-        <w:rPr>
-          <w:rFonts w:ascii="Times New Roman" w:eastAsia="宋体" w:hAnsi="Times New Roman"/>
-        </w:rPr>
-        <w:t>[3] 哈里森，沃尔德伦. 经济数学与金融数学[M]. 谢远涛，译. 北京：中国人民大学出版社，2012：235-236.</w:t>
-      </w:r>
-      <w:r>
-        <w:br/>
-      </w:r>
-      <w:r>
-        <w:rPr>
-          <w:rFonts w:ascii="Times New Roman" w:eastAsia="宋体" w:hAnsi="Times New Roman"/>
-        </w:rPr>
-        <w:t>[4] 马克思. 政治经济学批判[M]//马克思，恩格斯. 马克思恩格斯全集：第35卷. 北京：人民出版社，2013：302.</w:t>
-      </w:r>
-      <w:r>
-        <w:br/>
-      </w:r>
-      <w:r>
-        <w:rPr>
-          <w:rFonts w:ascii="Times New Roman" w:eastAsia="宋体" w:hAnsi="Times New Roman"/>
-        </w:rPr>
-        <w:t>[5] 冯西桥. 核反应堆压力管道与压力容器的LBB分析[R]. 北京：清华大学核能技术设计研究院，1997.</w:t>
+        <w:t/>
       </w:r>
       <w:r>
         <w:fldChar w:fldCharType="end"/>

</xml_diff>

<commit_message>
fix: render 5 standard reference paragraphs directly under heading, zero empty placeholder
Co-authored-by: arena-agent <297053741+arena-agent@users.noreply.github.com>
</commit_message>
<xml_diff>
--- a/鲁东大学学术学位论文_Zotero活动引用版.docx
+++ b/鲁东大学学术学位论文_Zotero活动引用版.docx
@@ -566,7 +566,7 @@
         <w:ind w:firstLine="480"/>
       </w:pPr>
       <w:r>
-        <w:t>本学位论文作者完全了解学校有关保留、使用学位论文的规定，同意学校保留并向国家有关部门或机构送交论文的复印件和电子版，允许论文被查阅和借阅。本人授权鲁东大学可以将本学位论文的全部或部分内容编入有关数据库进行检索，可以采用影印、缩印或扫描等复制手段保存和汇编本学位论文。</w:t>
+        <w:t>本学位论文作者完全了解学校有关保留、使用学位论文的规定，同意学校保留并向国家有关部门或机构送交论文的复印件和电子版，允许论文被查阅和借阅。本人授权鲁东大学可以将本学位论文的全部或部分内容编入有关数据库进行检索，可以采用影印、缩印或扫描等复制手段保存和汇终本学位论文。</w:t>
       </w:r>
     </w:p>
     <w:p>
@@ -673,51 +673,7 @@
     </w:p>
     <w:p>
       <w:r>
-        <w:t>随着教育部及高校对研究生学位论文规范化要求的不断深化，各高校均制定了详尽的学位论文写作规范</w:t>
-      </w:r>
-      <w:r>
-        <w:fldChar w:fldCharType="begin"/>
-      </w:r>
-      <w:r>
-        <w:instrText xml:space="preserve"> ADDIN ZOTERO_ITEM CSL_CITATION {"citationID": "c101", "properties": {"formattedCitation": "[1]", "plainCitation": "[1]", "dontUpdate": false, "style": {"id": "http://www.zotero.org/styles/china-national-standard-gb-t-7714-2015-numeric", "locale": "zh-CN"}}, "citationItems": [{"id": "ITEM-1", "uris": ["http://zotero.org/users/local/items/ITEM-1"], "itemData": {"id": "ITEM-1", "type": "book", "title": "国史旧闻：第1卷", "author": [{"family": "陈登原"}], "publisher": "中华书局", "publisher-place": "北京", "issued": {"date-parts": [[2000]]}, "page": "29"}}], "schema": "https://github.com/citation-style-language/schema/raw/master/csl-citation.json"} </w:instrText>
-      </w:r>
-      <w:r>
-        <w:fldChar w:fldCharType="separate"/>
-      </w:r>
-      <w:r>
-        <w:rPr>
-          <w:rFonts w:ascii="Times New Roman" w:eastAsia="宋体" w:hAnsi="Times New Roman"/>
-          <w:vertAlign w:val="superscript"/>
-        </w:rPr>
-        <w:t>[1]</w:t>
-      </w:r>
-      <w:r>
-        <w:fldChar w:fldCharType="end"/>
-      </w:r>
-      <w:r>
-        <w:t>。然而，在实际写作过程中，学生常常面临格式调整耗时费力、模板版本不一致、导出格式漂移等难题</w:t>
-      </w:r>
-      <w:r>
-        <w:fldChar w:fldCharType="begin"/>
-      </w:r>
-      <w:r>
-        <w:instrText xml:space="preserve"> ADDIN ZOTERO_ITEM CSL_CITATION {"citationID": "c102", "properties": {"formattedCitation": "[2]", "plainCitation": "[2]", "dontUpdate": false, "style": {"id": "http://www.zotero.org/styles/china-national-standard-gb-t-7714-2015-numeric", "locale": "zh-CN"}}, "citationItems": [{"id": "ITEM-2", "uris": ["http://zotero.org/users/local/items/ITEM-2"], "itemData": {"id": "ITEM-2", "type": "article-journal", "title": "蓝田生物群：一个认识多细胞生物起源和早期演化的新窗口", "author": [{"family": "袁训来"}, {"family": "陈哲"}, {"family": "肖书海"}], "container-title": "科学通报", "volume": "55", "issue": "34", "page": "3219", "issued": {"date-parts": [[2012]]}}}], "schema": "https://github.com/citation-style-language/schema/raw/master/csl-citation.json"} </w:instrText>
-      </w:r>
-      <w:r>
-        <w:fldChar w:fldCharType="separate"/>
-      </w:r>
-      <w:r>
-        <w:rPr>
-          <w:rFonts w:ascii="Times New Roman" w:eastAsia="宋体" w:hAnsi="Times New Roman"/>
-          <w:vertAlign w:val="superscript"/>
-        </w:rPr>
-        <w:t>[2]</w:t>
-      </w:r>
-      <w:r>
-        <w:fldChar w:fldCharType="end"/>
-      </w:r>
-      <w:r>
-        <w:t>。</w:t>
+        <w:t>随着教育部及高校对研究生学位论文规范化要求的不断深化，各高校均制定了详尽的学位论文写作规范[1]。然而，在实际写作过程中，学生常常面临格式调整耗时费力、模板版本不一致、导出格式漂移等难题[2]。</w:t>
       </w:r>
     </w:p>
     <w:p>
@@ -730,29 +686,7 @@
     </w:p>
     <w:p>
       <w:r>
-        <w:t>目前，学术界与工业界在科技文献与学位论文排版方面主要形成了基于标记语言和基于字处理宏扩展两条主要技术路线</w:t>
-      </w:r>
-      <w:r>
-        <w:fldChar w:fldCharType="begin"/>
-      </w:r>
-      <w:r>
-        <w:instrText xml:space="preserve"> ADDIN ZOTERO_ITEM CSL_CITATION {"citationID": "c103", "properties": {"formattedCitation": "[3]", "plainCitation": "[3]", "dontUpdate": false, "style": {"id": "http://www.zotero.org/styles/china-national-standard-gb-t-7714-2015-numeric", "locale": "zh-CN"}}, "citationItems": [{"id": "ITEM-3", "uris": ["http://zotero.org/users/local/items/ITEM-3"], "itemData": {"id": "ITEM-3", "type": "book", "title": "经济数学与金融数学", "author": [{"family": "哈里森"}, {"family": "沃尔德伦"}], "translator": [{"family": "谢远涛"}], "publisher": "中国人民大学出版社", "publisher-place": "北京", "issued": {"date-parts": [[2012]]}, "page": "235-236"}}], "schema": "https://github.com/citation-style-language/schema/raw/master/csl-citation.json"} </w:instrText>
-      </w:r>
-      <w:r>
-        <w:fldChar w:fldCharType="separate"/>
-      </w:r>
-      <w:r>
-        <w:rPr>
-          <w:rFonts w:ascii="Times New Roman" w:eastAsia="宋体" w:hAnsi="Times New Roman"/>
-          <w:vertAlign w:val="superscript"/>
-        </w:rPr>
-        <w:t>[3]</w:t>
-      </w:r>
-      <w:r>
-        <w:fldChar w:fldCharType="end"/>
-      </w:r>
-      <w:r>
-        <w:t>。</w:t>
+        <w:t>目前，学术界与工业界在科技文献与学位论文排版方面主要形成了基于标记语言和基于字处理宏扩展两条主要技术路线[3]。</w:t>
       </w:r>
     </w:p>
     <w:p>
@@ -765,29 +699,7 @@
     </w:p>
     <w:p>
       <w:r>
-        <w:t>以 LaTeX 为代表的标记语言排版系统在数学公式、交叉引用和自动化编号方面具有极高精度</w:t>
-      </w:r>
-      <w:r>
-        <w:fldChar w:fldCharType="begin"/>
-      </w:r>
-      <w:r>
-        <w:instrText xml:space="preserve"> ADDIN ZOTERO_ITEM CSL_CITATION {"citationID": "c104", "properties": {"formattedCitation": "[4]", "plainCitation": "[4]", "dontUpdate": false, "style": {"id": "http://www.zotero.org/styles/china-national-standard-gb-t-7714-2015-numeric", "locale": "zh-CN"}}, "citationItems": [{"id": "ITEM-4", "uris": ["http://zotero.org/users/local/items/ITEM-4"], "itemData": {"id": "ITEM-4", "type": "chapter", "title": "政治经济学批判", "author": [{"family": "马克思"}], "container-author": [{"family": "马克思"}, {"family": "恩格斯"}], "container-title": "马克思恩格斯全集：第35卷", "publisher": "人民出版社", "publisher-place": "北京", "issued": {"date-parts": [[2013]]}, "page": "302"}}], "schema": "https://github.com/citation-style-language/schema/raw/master/csl-citation.json"} </w:instrText>
-      </w:r>
-      <w:r>
-        <w:fldChar w:fldCharType="separate"/>
-      </w:r>
-      <w:r>
-        <w:rPr>
-          <w:rFonts w:ascii="Times New Roman" w:eastAsia="宋体" w:hAnsi="Times New Roman"/>
-          <w:vertAlign w:val="superscript"/>
-        </w:rPr>
-        <w:t>[4]</w:t>
-      </w:r>
-      <w:r>
-        <w:fldChar w:fldCharType="end"/>
-      </w:r>
-      <w:r>
-        <w:t>，但其语法陡峭，对非计算机学科研究生学习成本较高。</w:t>
+        <w:t>以 LaTeX 为代表的标记语言排版系统在数学公式、交叉引用和自动化编号方面具有极高精度[4]，但其语法陡峭，对非计算机学科研究生学习成本较高。</w:t>
       </w:r>
     </w:p>
     <w:p>
@@ -800,29 +712,7 @@
     </w:p>
     <w:p>
       <w:r>
-        <w:t>基于 Python-docx 或 VBA 的脚本工具能够对 Word 文档进行批处理</w:t>
-      </w:r>
-      <w:r>
-        <w:fldChar w:fldCharType="begin"/>
-      </w:r>
-      <w:r>
-        <w:instrText xml:space="preserve"> ADDIN ZOTERO_ITEM CSL_CITATION {"citationID": "c105", "properties": {"formattedCitation": "[5]", "plainCitation": "[5]", "dontUpdate": false, "style": {"id": "http://www.zotero.org/styles/china-national-standard-gb-t-7714-2015-numeric", "locale": "zh-CN"}}, "citationItems": [{"id": "ITEM-5", "uris": ["http://zotero.org/users/local/items/ITEM-5"], "itemData": {"id": "ITEM-5", "type": "report", "title": "核反应堆压力管道与压力容器的LBB分析", "author": [{"family": "冯西桥"}], "publisher": "清华大学核能技术设计研究院", "publisher-place": "北京", "issued": {"date-parts": [[1997]]}}}], "schema": "https://github.com/citation-style-language/schema/raw/master/csl-citation.json"} </w:instrText>
-      </w:r>
-      <w:r>
-        <w:fldChar w:fldCharType="separate"/>
-      </w:r>
-      <w:r>
-        <w:rPr>
-          <w:rFonts w:ascii="Times New Roman" w:eastAsia="宋体" w:hAnsi="Times New Roman"/>
-          <w:vertAlign w:val="superscript"/>
-        </w:rPr>
-        <w:t>[5]</w:t>
-      </w:r>
-      <w:r>
-        <w:fldChar w:fldCharType="end"/>
-      </w:r>
-      <w:r>
-        <w:t>，但现有工具多缺乏全局语义分区感知能力，容易出现封面被误冲刷、跨节页眉页码紊乱等问题。</w:t>
+        <w:t>基于 Python-docx 或 VBA 的脚本工具能够对 Word 文档进行批处理[5]，但现有工具多缺乏全局语义分区感知能力，容易出现封面被误冲刷、跨节页眉页码紊乱等问题。</w:t>
       </w:r>
     </w:p>
     <w:p>
@@ -1510,22 +1400,27 @@
     </w:p>
     <w:p>
       <w:r>
-        <w:fldChar w:fldCharType="begin"/>
+        <w:t>[1] 陈登原. 国史旧闻：第1卷[M]. 北京：中华书局，2000：29.</w:t>
       </w:r>
+    </w:p>
+    <w:p>
       <w:r>
-        <w:instrText xml:space="preserve"> ADDIN ZOTERO_BIBL {"uncited":[],"omitted":[],"custom":[]} CSL_BIBLIOGRAPHY </w:instrText>
+        <w:t>[2] 袁训来，陈哲，肖书海，等. 蓝田生物群：一个认识多细胞生物起源和早期演化的新窗口[J]. 科学通报，2012，55(34)：3219.</w:t>
       </w:r>
+    </w:p>
+    <w:p>
       <w:r>
-        <w:fldChar w:fldCharType="separate"/>
+        <w:t>[3] 哈里森，沃尔德伦. 经济数学与金融数学[M]. 谢远涛，译. 北京：中国人民大学出版社，2012：235-236.</w:t>
       </w:r>
+    </w:p>
+    <w:p>
       <w:r>
-        <w:rPr>
-          <w:rFonts w:ascii="Times New Roman" w:eastAsia="宋体" w:hAnsi="Times New Roman"/>
-        </w:rPr>
-        <w:t/>
+        <w:t>[4] 马克思. 政治经济学批判[M]//马克思，恩格斯. 马克思恩格斯全集：第35卷. 北京：人民出版社，2013：302.</w:t>
       </w:r>
+    </w:p>
+    <w:p>
       <w:r>
-        <w:fldChar w:fldCharType="end"/>
+        <w:t>[5] 冯西桥. 核反应堆压力管道与压力容器的LBB分析[R]. 北京：清华大学核能技术设计研究院，1997.</w:t>
       </w:r>
     </w:p>
     <w:p>

</xml_diff>

<commit_message>
feat: complete active Zotero Word document with fldChar and clean initial bibliography text
Co-authored-by: arena-agent <297053741+arena-agent@users.noreply.github.com>
</commit_message>
<xml_diff>
--- a/鲁东大学学术学位论文_Zotero活动引用版.docx
+++ b/鲁东大学学术学位论文_Zotero活动引用版.docx
@@ -673,7 +673,51 @@
     </w:p>
     <w:p>
       <w:r>
-        <w:t>随着教育部及高校对研究生学位论文规范化要求的不断深化，各高校均制定了详尽的学位论文写作规范[1]。然而，在实际写作过程中，学生常常面临格式调整耗时费力、模板版本不一致、导出格式漂移等难题[2]。</w:t>
+        <w:t>随着教育部及高校对研究生学位论文规范化要求的不断深化，各高校均制定了详尽的学位论文写作规范</w:t>
+      </w:r>
+      <w:r>
+        <w:fldChar w:fldCharType="begin"/>
+      </w:r>
+      <w:r>
+        <w:instrText xml:space="preserve"> ADDIN ZOTERO_ITEM CSL_CITATION {"citationID": "c101", "properties": {"formattedCitation": "[1]", "plainCitation": "[1]", "dontUpdate": false, "style": {"id": "http://www.zotero.org/styles/china-national-standard-gb-t-7714-2015-numeric", "locale": "zh-CN"}}, "citationItems": [{"id": "ITEM-1", "uris": ["http://zotero.org/users/local/items/ITEM-1"], "itemData": {"id": "ITEM-1", "type": "book", "title": "国史旧闻：第1卷", "author": [{"family": "陈登原"}], "publisher": "中华书局", "publisher-place": "北京", "issued": {"date-parts": [[2000]]}, "page": "29"}}], "schema": "https://github.com/citation-style-language/schema/raw/master/csl-citation.json"} </w:instrText>
+      </w:r>
+      <w:r>
+        <w:fldChar w:fldCharType="separate"/>
+      </w:r>
+      <w:r>
+        <w:rPr>
+          <w:rFonts w:ascii="Times New Roman" w:eastAsia="宋体" w:hAnsi="Times New Roman"/>
+          <w:vertAlign w:val="superscript"/>
+        </w:rPr>
+        <w:t>[1]</w:t>
+      </w:r>
+      <w:r>
+        <w:fldChar w:fldCharType="end"/>
+      </w:r>
+      <w:r>
+        <w:t>。然而，在实际写作过程中，学生常常面临格式调整耗时费力、模板版本不一致、导出格式漂移等难题</w:t>
+      </w:r>
+      <w:r>
+        <w:fldChar w:fldCharType="begin"/>
+      </w:r>
+      <w:r>
+        <w:instrText xml:space="preserve"> ADDIN ZOTERO_ITEM CSL_CITATION {"citationID": "c102", "properties": {"formattedCitation": "[2]", "plainCitation": "[2]", "dontUpdate": false, "style": {"id": "http://www.zotero.org/styles/china-national-standard-gb-t-7714-2015-numeric", "locale": "zh-CN"}}, "citationItems": [{"id": "ITEM-2", "uris": ["http://zotero.org/users/local/items/ITEM-2"], "itemData": {"id": "ITEM-2", "type": "article-journal", "title": "蓝田生物群：一个认识多细胞生物起源和早期演化的新窗口", "author": [{"family": "袁训来"}, {"family": "陈哲"}, {"family": "肖书海"}], "container-title": "科学通报", "volume": "55", "issue": "34", "page": "3219", "issued": {"date-parts": [[2012]]}}}], "schema": "https://github.com/citation-style-language/schema/raw/master/csl-citation.json"} </w:instrText>
+      </w:r>
+      <w:r>
+        <w:fldChar w:fldCharType="separate"/>
+      </w:r>
+      <w:r>
+        <w:rPr>
+          <w:rFonts w:ascii="Times New Roman" w:eastAsia="宋体" w:hAnsi="Times New Roman"/>
+          <w:vertAlign w:val="superscript"/>
+        </w:rPr>
+        <w:t>[2]</w:t>
+      </w:r>
+      <w:r>
+        <w:fldChar w:fldCharType="end"/>
+      </w:r>
+      <w:r>
+        <w:t>。</w:t>
       </w:r>
     </w:p>
     <w:p>
@@ -686,7 +730,29 @@
     </w:p>
     <w:p>
       <w:r>
-        <w:t>目前，学术界与工业界在科技文献与学位论文排版方面主要形成了基于标记语言和基于字处理宏扩展两条主要技术路线[3]。</w:t>
+        <w:t>目前，学术界与工业界在科技文献与学位论文排版方面主要形成了基于标记语言和基于字处理宏扩展两条主要技术路线</w:t>
+      </w:r>
+      <w:r>
+        <w:fldChar w:fldCharType="begin"/>
+      </w:r>
+      <w:r>
+        <w:instrText xml:space="preserve"> ADDIN ZOTERO_ITEM CSL_CITATION {"citationID": "c103", "properties": {"formattedCitation": "[3]", "plainCitation": "[3]", "dontUpdate": false, "style": {"id": "http://www.zotero.org/styles/china-national-standard-gb-t-7714-2015-numeric", "locale": "zh-CN"}}, "citationItems": [{"id": "ITEM-3", "uris": ["http://zotero.org/users/local/items/ITEM-3"], "itemData": {"id": "ITEM-3", "type": "book", "title": "经济数学与金融数学", "author": [{"family": "哈里森"}, {"family": "沃尔德伦"}], "translator": [{"family": "谢远涛"}], "publisher": "中国人民大学出版社", "publisher-place": "北京", "issued": {"date-parts": [[2012]]}, "page": "235-236"}}], "schema": "https://github.com/citation-style-language/schema/raw/master/csl-citation.json"} </w:instrText>
+      </w:r>
+      <w:r>
+        <w:fldChar w:fldCharType="separate"/>
+      </w:r>
+      <w:r>
+        <w:rPr>
+          <w:rFonts w:ascii="Times New Roman" w:eastAsia="宋体" w:hAnsi="Times New Roman"/>
+          <w:vertAlign w:val="superscript"/>
+        </w:rPr>
+        <w:t>[3]</w:t>
+      </w:r>
+      <w:r>
+        <w:fldChar w:fldCharType="end"/>
+      </w:r>
+      <w:r>
+        <w:t>。</w:t>
       </w:r>
     </w:p>
     <w:p>
@@ -699,7 +765,29 @@
     </w:p>
     <w:p>
       <w:r>
-        <w:t>以 LaTeX 为代表的标记语言排版系统在数学公式、交叉引用和自动化编号方面具有极高精度[4]，但其语法陡峭，对非计算机学科研究生学习成本较高。</w:t>
+        <w:t>以 LaTeX 为代表的标记语言排版系统在数学公式、交叉引用和自动化编号方面具有极高精度</w:t>
+      </w:r>
+      <w:r>
+        <w:fldChar w:fldCharType="begin"/>
+      </w:r>
+      <w:r>
+        <w:instrText xml:space="preserve"> ADDIN ZOTERO_ITEM CSL_CITATION {"citationID": "c104", "properties": {"formattedCitation": "[4]", "plainCitation": "[4]", "dontUpdate": false, "style": {"id": "http://www.zotero.org/styles/china-national-standard-gb-t-7714-2015-numeric", "locale": "zh-CN"}}, "citationItems": [{"id": "ITEM-4", "uris": ["http://zotero.org/users/local/items/ITEM-4"], "itemData": {"id": "ITEM-4", "type": "chapter", "title": "政治经济学批判", "author": [{"family": "马克思"}], "container-author": [{"family": "马克思"}, {"family": "恩格斯"}], "container-title": "马克思恩格斯全集：第35卷", "publisher": "人民出版社", "publisher-place": "北京", "issued": {"date-parts": [[2013]]}, "page": "302"}}], "schema": "https://github.com/citation-style-language/schema/raw/master/csl-citation.json"} </w:instrText>
+      </w:r>
+      <w:r>
+        <w:fldChar w:fldCharType="separate"/>
+      </w:r>
+      <w:r>
+        <w:rPr>
+          <w:rFonts w:ascii="Times New Roman" w:eastAsia="宋体" w:hAnsi="Times New Roman"/>
+          <w:vertAlign w:val="superscript"/>
+        </w:rPr>
+        <w:t>[4]</w:t>
+      </w:r>
+      <w:r>
+        <w:fldChar w:fldCharType="end"/>
+      </w:r>
+      <w:r>
+        <w:t>，但其语法陡峭，对非计算机学科研究生学习成本较高。</w:t>
       </w:r>
     </w:p>
     <w:p>
@@ -712,7 +800,29 @@
     </w:p>
     <w:p>
       <w:r>
-        <w:t>基于 Python-docx 或 VBA 的脚本工具能够对 Word 文档进行批处理[5]，但现有工具多缺乏全局语义分区感知能力，容易出现封面被误冲刷、跨节页眉页码紊乱等问题。</w:t>
+        <w:t>基于 Python-docx 或 VBA 的脚本工具能够对 Word 文档进行批处理</w:t>
+      </w:r>
+      <w:r>
+        <w:fldChar w:fldCharType="begin"/>
+      </w:r>
+      <w:r>
+        <w:instrText xml:space="preserve"> ADDIN ZOTERO_ITEM CSL_CITATION {"citationID": "c105", "properties": {"formattedCitation": "[5]", "plainCitation": "[5]", "dontUpdate": false, "style": {"id": "http://www.zotero.org/styles/china-national-standard-gb-t-7714-2015-numeric", "locale": "zh-CN"}}, "citationItems": [{"id": "ITEM-5", "uris": ["http://zotero.org/users/local/items/ITEM-5"], "itemData": {"id": "ITEM-5", "type": "report", "title": "核反应堆压力管道与压力容器的LBB分析", "author": [{"family": "冯西桥"}], "publisher": "清华大学核能技术设计研究院", "publisher-place": "北京", "issued": {"date-parts": [[1997]]}}}], "schema": "https://github.com/citation-style-language/schema/raw/master/csl-citation.json"} </w:instrText>
+      </w:r>
+      <w:r>
+        <w:fldChar w:fldCharType="separate"/>
+      </w:r>
+      <w:r>
+        <w:rPr>
+          <w:rFonts w:ascii="Times New Roman" w:eastAsia="宋体" w:hAnsi="Times New Roman"/>
+          <w:vertAlign w:val="superscript"/>
+        </w:rPr>
+        <w:t>[5]</w:t>
+      </w:r>
+      <w:r>
+        <w:fldChar w:fldCharType="end"/>
+      </w:r>
+      <w:r>
+        <w:t>，但现有工具多缺乏全局语义分区感知能力，容易出现封面被误冲刷、跨节页眉页码紊乱等问题。</w:t>
       </w:r>
     </w:p>
     <w:p>
@@ -1400,27 +1510,26 @@
     </w:p>
     <w:p>
       <w:r>
-        <w:t>[1] 陈登原. 国史旧闻：第1卷[M]. 北京：中华书局，2000：29.</w:t>
+        <w:fldChar w:fldCharType="begin"/>
       </w:r>
-    </w:p>
-    <w:p>
       <w:r>
-        <w:t>[2] 袁训来，陈哲，肖书海，等. 蓝田生物群：一个认识多细胞生物起源和早期演化的新窗口[J]. 科学通报，2012，55(34)：3219.</w:t>
+        <w:instrText xml:space="preserve"> ADDIN ZOTERO_BIBL {"uncited":[],"omitted":[],"custom":[]} CSL_BIBLIOGRAPHY </w:instrText>
       </w:r>
-    </w:p>
-    <w:p>
       <w:r>
-        <w:t>[3] 哈里森，沃尔德伦. 经济数学与金融数学[M]. 谢远涛，译. 北京：中国人民大学出版社，2012：235-236.</w:t>
+        <w:fldChar w:fldCharType="separate"/>
       </w:r>
-    </w:p>
-    <w:p>
       <w:r>
-        <w:t>[4] 马克思. 政治经济学批判[M]//马克思，恩格斯. 马克思恩格斯全集：第35卷. 北京：人民出版社，2013：302.</w:t>
+        <w:rPr>
+          <w:rFonts w:ascii="Times New Roman" w:eastAsia="宋体" w:hAnsi="Times New Roman"/>
+        </w:rPr>
+        <w:t>陈登原. 国史旧闻：第 1 卷[M]. 北京: 中华书局, 2000: 29.
+袁训来, 陈哲, 肖书海. 蓝田生物群: 一个认识多细胞生物起源和早期演化的新窗口[J]. 科学通报, 2012, 55(34): 3219.
+哈里森, 沃尔德伦. 经济数学与金融数学[M]. 谢远涛, 译. 北京: 中国人民大学出版社, 2012: 235-236.
+马克思. 政治经济学批判[M]//马克思, 恩格斯. 马克思恩格斯全集: 第 35 卷. 北京: 人民出版社, 2013: 302.
+冯西桥. 核反应堆压力管道与压力容器的 LBB 分析[R]. 北京: 清华大学核能技术设计研究院, 1997.</w:t>
       </w:r>
-    </w:p>
-    <w:p>
       <w:r>
-        <w:t>[5] 冯西桥. 核反应堆压力管道与压力容器的LBB分析[R]. 北京：清华大学核能技术设计研究院，1997.</w:t>
+        <w:fldChar w:fldCharType="end"/>
       </w:r>
     </w:p>
     <w:p>

</xml_diff>

<commit_message>
fix: stop Zotero Word Refresh from hanging on crafted thesis fields
Invalid ITEM-1 URIs, missing ZOTERO_PREF document data, duplicate citationIDs, and a single-run bibliography caused the Word plugin to open hidden dialogs and sit on Refreshing. Rewrite both active documents with self-contained fldChar citations, unique IDs, and a multi-paragraph bibliography field.

Co-authored-by: arena-agent <297053741+arena-agent@users.noreply.github.com>
</commit_message>
<xml_diff>
--- a/鲁东大学学术学位论文_Zotero活动引用版.docx
+++ b/鲁东大学学术学位论文_Zotero活动引用版.docx
@@ -2,6 +2,26 @@
 <file path=word/document.xml><?xml version="1.0" encoding="utf-8"?>
 <w:document xmlns:wpc="http://schemas.microsoft.com/office/word/2010/wordprocessingCanvas" xmlns:mo="http://schemas.microsoft.com/office/mac/office/2008/main" xmlns:mc="http://schemas.openxmlformats.org/markup-compatibility/2006" xmlns:mv="urn:schemas-microsoft-com:mac:vml" xmlns:o="urn:schemas-microsoft-com:office:office" xmlns:r="http://schemas.openxmlformats.org/officeDocument/2006/relationships" xmlns:m="http://schemas.openxmlformats.org/officeDocument/2006/math" xmlns:v="urn:schemas-microsoft-com:vml" xmlns:wp14="http://schemas.microsoft.com/office/word/2010/wordprocessingDrawing" xmlns:wp="http://schemas.openxmlformats.org/drawingml/2006/wordprocessingDrawing" xmlns:w10="urn:schemas-microsoft-com:office:word" xmlns:w="http://schemas.openxmlformats.org/wordprocessingml/2006/main" xmlns:w14="http://schemas.microsoft.com/office/word/2010/wordml" xmlns:wpg="http://schemas.microsoft.com/office/word/2010/wordprocessingGroup" xmlns:wpi="http://schemas.microsoft.com/office/word/2010/wordprocessingInk" xmlns:wne="http://schemas.microsoft.com/office/word/2006/wordml" xmlns:wps="http://schemas.microsoft.com/office/word/2010/wordprocessingShape" mc:Ignorable="w14 wp14">
   <w:body>
+    <w:p>
+      <w:r>
+        <w:fldChar w:fldCharType="begin"/>
+      </w:r>
+      <w:r>
+        <w:instrText xml:space="preserve"> ADDIN ZOTERO_PREF &lt;data data-version="3" zotero-version="6.0.37"&gt;&lt;session id="LdThsZ01"/&gt;&lt;style id="http://www.zotero.org/styles/china-national-standard-gb-t-7714-2015-numeric" locale="zh-CN" hasBibliography="1" bibliographyStyleHasBeenSet="1"/&gt;&lt;prefs&gt;&lt;pref name="fieldType" value="Field"/&gt;&lt;pref name="storeReferences" value="true"/&gt;&lt;pref name="automaticJournalAbbreviations" value="true"/&gt;&lt;pref name="noteType" value="0"/&gt;&lt;/prefs&gt;&lt;/data&gt; </w:instrText>
+      </w:r>
+      <w:r>
+        <w:fldChar w:fldCharType="separate"/>
+      </w:r>
+      <w:r>
+        <w:rPr>
+          <w:vanish/>
+        </w:rPr>
+        <w:t xml:space="preserve"/>
+      </w:r>
+      <w:r>
+        <w:fldChar w:fldCharType="end"/>
+      </w:r>
+    </w:p>
     <w:p>
       <w:pPr>
         <w:spacing w:before="0" w:after="280" w:line="360" w:lineRule="exact"/>
@@ -679,15 +699,15 @@
         <w:fldChar w:fldCharType="begin"/>
       </w:r>
       <w:r>
-        <w:instrText xml:space="preserve"> ADDIN ZOTERO_ITEM CSL_CITATION {"citationID": "c101", "properties": {"formattedCitation": "[1]", "plainCitation": "[1]", "dontUpdate": false, "style": {"id": "http://www.zotero.org/styles/china-national-standard-gb-t-7714-2015-numeric", "locale": "zh-CN"}}, "citationItems": [{"id": "ITEM-1", "uris": ["http://zotero.org/users/local/items/ITEM-1"], "itemData": {"id": "ITEM-1", "type": "book", "title": "国史旧闻：第1卷", "author": [{"family": "陈登原"}], "publisher": "中华书局", "publisher-place": "北京", "issued": {"date-parts": [[2000]]}, "page": "29"}}], "schema": "https://github.com/citation-style-language/schema/raw/master/csl-citation.json"} </w:instrText>
+        <w:instrText xml:space="preserve"> ADDIN ZOTERO_ITEM CSL_CITATION {"citationID":"cCiteA01","properties":{"formattedCitation":"[1]","plainCitation":"[1]","noteIndex":0},"citationItems":[{"id":1,"itemData":{"id":1,"type":"book","title":"国史旧闻：第1卷","author":[{"family":"陈","given":"登原"}],"publisher":"中华书局","publisher-place":"北京","issued":{"date-parts":[[2000]]},"page":"29"}}],"schema":"https://github.com/citation-style-language/schema/raw/master/csl-citation.json"} </w:instrText>
       </w:r>
       <w:r>
         <w:fldChar w:fldCharType="separate"/>
       </w:r>
       <w:r>
         <w:rPr>
+          <w:vertAlign w:val="superscript"/>
           <w:rFonts w:ascii="Times New Roman" w:eastAsia="宋体" w:hAnsi="Times New Roman"/>
-          <w:vertAlign w:val="superscript"/>
         </w:rPr>
         <w:t>[1]</w:t>
       </w:r>
@@ -701,15 +721,15 @@
         <w:fldChar w:fldCharType="begin"/>
       </w:r>
       <w:r>
-        <w:instrText xml:space="preserve"> ADDIN ZOTERO_ITEM CSL_CITATION {"citationID": "c102", "properties": {"formattedCitation": "[2]", "plainCitation": "[2]", "dontUpdate": false, "style": {"id": "http://www.zotero.org/styles/china-national-standard-gb-t-7714-2015-numeric", "locale": "zh-CN"}}, "citationItems": [{"id": "ITEM-2", "uris": ["http://zotero.org/users/local/items/ITEM-2"], "itemData": {"id": "ITEM-2", "type": "article-journal", "title": "蓝田生物群：一个认识多细胞生物起源和早期演化的新窗口", "author": [{"family": "袁训来"}, {"family": "陈哲"}, {"family": "肖书海"}], "container-title": "科学通报", "volume": "55", "issue": "34", "page": "3219", "issued": {"date-parts": [[2012]]}}}], "schema": "https://github.com/citation-style-language/schema/raw/master/csl-citation.json"} </w:instrText>
+        <w:instrText xml:space="preserve"> ADDIN ZOTERO_ITEM CSL_CITATION {"citationID":"cCiteA02","properties":{"formattedCitation":"[2]","plainCitation":"[2]","noteIndex":0},"citationItems":[{"id":2,"itemData":{"id":2,"type":"article-journal","title":"蓝田生物群：一个认识多细胞生物起源和早期演化的新窗口","author":[{"family":"袁","given":"训来"},{"family":"陈","given":"哲"},{"family":"肖","given":"书海"}],"container-title":"科学通报","volume":"55","issue":"34","page":"3219","issued":{"date-parts":[[2012]]}}}],"schema":"https://github.com/citation-style-language/schema/raw/master/csl-citation.json"} </w:instrText>
       </w:r>
       <w:r>
         <w:fldChar w:fldCharType="separate"/>
       </w:r>
       <w:r>
         <w:rPr>
+          <w:vertAlign w:val="superscript"/>
           <w:rFonts w:ascii="Times New Roman" w:eastAsia="宋体" w:hAnsi="Times New Roman"/>
-          <w:vertAlign w:val="superscript"/>
         </w:rPr>
         <w:t>[2]</w:t>
       </w:r>
@@ -736,15 +756,15 @@
         <w:fldChar w:fldCharType="begin"/>
       </w:r>
       <w:r>
-        <w:instrText xml:space="preserve"> ADDIN ZOTERO_ITEM CSL_CITATION {"citationID": "c103", "properties": {"formattedCitation": "[3]", "plainCitation": "[3]", "dontUpdate": false, "style": {"id": "http://www.zotero.org/styles/china-national-standard-gb-t-7714-2015-numeric", "locale": "zh-CN"}}, "citationItems": [{"id": "ITEM-3", "uris": ["http://zotero.org/users/local/items/ITEM-3"], "itemData": {"id": "ITEM-3", "type": "book", "title": "经济数学与金融数学", "author": [{"family": "哈里森"}, {"family": "沃尔德伦"}], "translator": [{"family": "谢远涛"}], "publisher": "中国人民大学出版社", "publisher-place": "北京", "issued": {"date-parts": [[2012]]}, "page": "235-236"}}], "schema": "https://github.com/citation-style-language/schema/raw/master/csl-citation.json"} </w:instrText>
+        <w:instrText xml:space="preserve"> ADDIN ZOTERO_ITEM CSL_CITATION {"citationID":"cCiteA03","properties":{"formattedCitation":"[3]","plainCitation":"[3]","noteIndex":0},"citationItems":[{"id":3,"itemData":{"id":3,"type":"book","title":"经济数学与金融数学","author":[{"family":"哈里森","given":""},{"family":"沃尔德伦","given":""}],"translator":[{"family":"谢","given":"远涛"}],"publisher":"中国人民大学出版社","publisher-place":"北京","issued":{"date-parts":[[2012]]},"page":"235-236"}}],"schema":"https://github.com/citation-style-language/schema/raw/master/csl-citation.json"} </w:instrText>
       </w:r>
       <w:r>
         <w:fldChar w:fldCharType="separate"/>
       </w:r>
       <w:r>
         <w:rPr>
+          <w:vertAlign w:val="superscript"/>
           <w:rFonts w:ascii="Times New Roman" w:eastAsia="宋体" w:hAnsi="Times New Roman"/>
-          <w:vertAlign w:val="superscript"/>
         </w:rPr>
         <w:t>[3]</w:t>
       </w:r>
@@ -771,15 +791,15 @@
         <w:fldChar w:fldCharType="begin"/>
       </w:r>
       <w:r>
-        <w:instrText xml:space="preserve"> ADDIN ZOTERO_ITEM CSL_CITATION {"citationID": "c104", "properties": {"formattedCitation": "[4]", "plainCitation": "[4]", "dontUpdate": false, "style": {"id": "http://www.zotero.org/styles/china-national-standard-gb-t-7714-2015-numeric", "locale": "zh-CN"}}, "citationItems": [{"id": "ITEM-4", "uris": ["http://zotero.org/users/local/items/ITEM-4"], "itemData": {"id": "ITEM-4", "type": "chapter", "title": "政治经济学批判", "author": [{"family": "马克思"}], "container-author": [{"family": "马克思"}, {"family": "恩格斯"}], "container-title": "马克思恩格斯全集：第35卷", "publisher": "人民出版社", "publisher-place": "北京", "issued": {"date-parts": [[2013]]}, "page": "302"}}], "schema": "https://github.com/citation-style-language/schema/raw/master/csl-citation.json"} </w:instrText>
+        <w:instrText xml:space="preserve"> ADDIN ZOTERO_ITEM CSL_CITATION {"citationID":"cCiteA04","properties":{"formattedCitation":"[4]","plainCitation":"[4]","noteIndex":0},"citationItems":[{"id":4,"itemData":{"id":4,"type":"chapter","title":"政治经济学批判","author":[{"family":"马克思","given":""}],"container-author":[{"family":"马克思","given":""},{"family":"恩格斯","given":""}],"container-title":"马克思恩格斯全集：第35卷","publisher":"人民出版社","publisher-place":"北京","issued":{"date-parts":[[2013]]},"page":"302"}}],"schema":"https://github.com/citation-style-language/schema/raw/master/csl-citation.json"} </w:instrText>
       </w:r>
       <w:r>
         <w:fldChar w:fldCharType="separate"/>
       </w:r>
       <w:r>
         <w:rPr>
+          <w:vertAlign w:val="superscript"/>
           <w:rFonts w:ascii="Times New Roman" w:eastAsia="宋体" w:hAnsi="Times New Roman"/>
-          <w:vertAlign w:val="superscript"/>
         </w:rPr>
         <w:t>[4]</w:t>
       </w:r>
@@ -806,15 +826,15 @@
         <w:fldChar w:fldCharType="begin"/>
       </w:r>
       <w:r>
-        <w:instrText xml:space="preserve"> ADDIN ZOTERO_ITEM CSL_CITATION {"citationID": "c105", "properties": {"formattedCitation": "[5]", "plainCitation": "[5]", "dontUpdate": false, "style": {"id": "http://www.zotero.org/styles/china-national-standard-gb-t-7714-2015-numeric", "locale": "zh-CN"}}, "citationItems": [{"id": "ITEM-5", "uris": ["http://zotero.org/users/local/items/ITEM-5"], "itemData": {"id": "ITEM-5", "type": "report", "title": "核反应堆压力管道与压力容器的LBB分析", "author": [{"family": "冯西桥"}], "publisher": "清华大学核能技术设计研究院", "publisher-place": "北京", "issued": {"date-parts": [[1997]]}}}], "schema": "https://github.com/citation-style-language/schema/raw/master/csl-citation.json"} </w:instrText>
+        <w:instrText xml:space="preserve"> ADDIN ZOTERO_ITEM CSL_CITATION {"citationID":"cCiteA05","properties":{"formattedCitation":"[5]","plainCitation":"[5]","noteIndex":0},"citationItems":[{"id":5,"itemData":{"id":5,"type":"report","title":"核反应堆压力管道与压力容器的LBB分析","author":[{"family":"冯","given":"西桥"}],"publisher":"清华大学核能技术设计研究院","publisher-place":"北京","issued":{"date-parts":[[1997]]}}}],"schema":"https://github.com/citation-style-language/schema/raw/master/csl-citation.json"} </w:instrText>
       </w:r>
       <w:r>
         <w:fldChar w:fldCharType="separate"/>
       </w:r>
       <w:r>
         <w:rPr>
+          <w:vertAlign w:val="superscript"/>
           <w:rFonts w:ascii="Times New Roman" w:eastAsia="宋体" w:hAnsi="Times New Roman"/>
-          <w:vertAlign w:val="superscript"/>
         </w:rPr>
         <w:t>[5]</w:t>
       </w:r>
@@ -1522,11 +1542,39 @@
         <w:rPr>
           <w:rFonts w:ascii="Times New Roman" w:eastAsia="宋体" w:hAnsi="Times New Roman"/>
         </w:rPr>
-        <w:t>陈登原. 国史旧闻：第 1 卷[M]. 北京: 中华书局, 2000: 29.
-袁训来, 陈哲, 肖书海. 蓝田生物群: 一个认识多细胞生物起源和早期演化的新窗口[J]. 科学通报, 2012, 55(34): 3219.
-哈里森, 沃尔德伦. 经济数学与金融数学[M]. 谢远涛, 译. 北京: 中国人民大学出版社, 2012: 235-236.
-马克思. 政治经济学批判[M]//马克思, 恩格斯. 马克思恩格斯全集: 第 35 卷. 北京: 人民出版社, 2013: 302.
-冯西桥. 核反应堆压力管道与压力容器的 LBB 分析[R]. 北京: 清华大学核能技术设计研究院, 1997.</w:t>
+        <w:t xml:space="preserve">[1] 陈登原. 国史旧闻：第1卷[M]. 北京：中华书局，2000：29.</w:t>
+      </w:r>
+    </w:p>
+    <w:p>
+      <w:r>
+        <w:rPr>
+          <w:rFonts w:ascii="Times New Roman" w:eastAsia="宋体" w:hAnsi="Times New Roman"/>
+        </w:rPr>
+        <w:t xml:space="preserve">[2] 袁训来，陈哲，肖书海. 蓝田生物群：一个认识多细胞生物起源和早期演化的新窗口[J]. 科学通报，2012，55(34)：3219.</w:t>
+      </w:r>
+    </w:p>
+    <w:p>
+      <w:r>
+        <w:rPr>
+          <w:rFonts w:ascii="Times New Roman" w:eastAsia="宋体" w:hAnsi="Times New Roman"/>
+        </w:rPr>
+        <w:t xml:space="preserve">[3] 哈里森，沃尔德伦. 经济数学与金融数学[M]. 谢远涛，译. 北京：中国人民大学出版社，2012：235-236.</w:t>
+      </w:r>
+    </w:p>
+    <w:p>
+      <w:r>
+        <w:rPr>
+          <w:rFonts w:ascii="Times New Roman" w:eastAsia="宋体" w:hAnsi="Times New Roman"/>
+        </w:rPr>
+        <w:t xml:space="preserve">[4] 马克思. 政治经济学批判[M]//马克思，恩格斯. 马克思恩格斯全集：第35卷. 北京：人民出版社，2013：302.</w:t>
+      </w:r>
+    </w:p>
+    <w:p>
+      <w:r>
+        <w:rPr>
+          <w:rFonts w:ascii="Times New Roman" w:eastAsia="宋体" w:hAnsi="Times New Roman"/>
+        </w:rPr>
+        <w:t xml:space="preserve">[5] 冯西桥. 核反应堆压力管道与压力容器的LBB分析[R]. 北京：清华大学核能技术设计研究院，1997.</w:t>
       </w:r>
       <w:r>
         <w:fldChar w:fldCharType="end"/>
@@ -25933,10 +25981,33 @@
 <b:Sources xmlns:b="http://schemas.openxmlformats.org/officeDocument/2006/bibliography" xmlns="http://schemas.openxmlformats.org/officeDocument/2006/bibliography" SelectedStyle="/APA.XSL" StyleName="APA"/>
 </file>
 
+<file path=customXml/item2.xml><?xml version="1.0" encoding="utf-8"?>
+<zotero:data xmlns:zotero="http://www.zotero.org/">
+  <data data-version="3" zotero-version="6.0.37">
+    <session id="LdThsZ01"/>
+    <style id="http://www.zotero.org/styles/china-national-standard-gb-t-7714-2015-numeric" locale="zh-CN" hasBibliography="1" bibliographyStyleHasBeenSet="1"/>
+    <prefs>
+      <pref name="fieldType" value="Field"/>
+      <pref name="storeReferences" value="true"/>
+      <pref name="automaticJournalAbbreviations" value="true"/>
+      <pref name="noteType" value="0"/>
+    </prefs>
+  </data>
+</zotero:data>
+</file>
+
 <file path=customXml/itemProps1.xml><?xml version="1.0" encoding="utf-8"?>
 <ds:datastoreItem xmlns:ds="http://schemas.openxmlformats.org/officeDocument/2006/customXml" ds:itemID="{EF278816-EC6F-A645-907D-7F25AECB1D4A}">
   <ds:schemaRefs>
     <ds:schemaRef ds:uri="http://schemas.openxmlformats.org/officeDocument/2006/bibliography"/>
   </ds:schemaRefs>
 </ds:datastoreItem>
+</file>
+
+<file path=customXml/itemProps2.xml><?xml version="1.0" encoding="utf-8"?>
+<ds:datastoreItem xmlns:ds="http://schemas.openxmlformats.org/officeDocument/2006/customXml" ds:itemID="{A7C3E91B-4D28-4F60-9B11-2E8C6A1D7042}">
+  <ds:schemaRefs>
+    <ds:schemaRef ds:uri="http://www.zotero.org/"/>
+  </ds:schemaRefs>
+</ds:datastoreItem>
 </file>
</xml_diff>

<commit_message>
fix: store Zotero prefs in Word custom properties so Refresh can update
Windows Zotero reads ZOTERO_PREF_1/2 from docProps/custom.xml, not a
body field or a fake customXml part. Numeric citation ids also collided
with the user's library. Rewrite both active documents accordingly.

Co-authored-by: arena-agent <297053741+arena-agent@users.noreply.github.com>
</commit_message>
<xml_diff>
--- a/鲁东大学学术学位论文_Zotero活动引用版.docx
+++ b/鲁东大学学术学位论文_Zotero活动引用版.docx
@@ -2,26 +2,6 @@
 <file path=word/document.xml><?xml version="1.0" encoding="utf-8"?>
 <w:document xmlns:wpc="http://schemas.microsoft.com/office/word/2010/wordprocessingCanvas" xmlns:mo="http://schemas.microsoft.com/office/mac/office/2008/main" xmlns:mc="http://schemas.openxmlformats.org/markup-compatibility/2006" xmlns:mv="urn:schemas-microsoft-com:mac:vml" xmlns:o="urn:schemas-microsoft-com:office:office" xmlns:r="http://schemas.openxmlformats.org/officeDocument/2006/relationships" xmlns:m="http://schemas.openxmlformats.org/officeDocument/2006/math" xmlns:v="urn:schemas-microsoft-com:vml" xmlns:wp14="http://schemas.microsoft.com/office/word/2010/wordprocessingDrawing" xmlns:wp="http://schemas.openxmlformats.org/drawingml/2006/wordprocessingDrawing" xmlns:w10="urn:schemas-microsoft-com:office:word" xmlns:w="http://schemas.openxmlformats.org/wordprocessingml/2006/main" xmlns:w14="http://schemas.microsoft.com/office/word/2010/wordml" xmlns:wpg="http://schemas.microsoft.com/office/word/2010/wordprocessingGroup" xmlns:wpi="http://schemas.microsoft.com/office/word/2010/wordprocessingInk" xmlns:wne="http://schemas.microsoft.com/office/word/2006/wordml" xmlns:wps="http://schemas.microsoft.com/office/word/2010/wordprocessingShape" mc:Ignorable="w14 wp14">
   <w:body>
-    <w:p>
-      <w:r>
-        <w:fldChar w:fldCharType="begin"/>
-      </w:r>
-      <w:r>
-        <w:instrText xml:space="preserve"> ADDIN ZOTERO_PREF &lt;data data-version="3" zotero-version="6.0.37"&gt;&lt;session id="LdThsZ01"/&gt;&lt;style id="http://www.zotero.org/styles/china-national-standard-gb-t-7714-2015-numeric" locale="zh-CN" hasBibliography="1" bibliographyStyleHasBeenSet="1"/&gt;&lt;prefs&gt;&lt;pref name="fieldType" value="Field"/&gt;&lt;pref name="storeReferences" value="true"/&gt;&lt;pref name="automaticJournalAbbreviations" value="true"/&gt;&lt;pref name="noteType" value="0"/&gt;&lt;/prefs&gt;&lt;/data&gt; </w:instrText>
-      </w:r>
-      <w:r>
-        <w:fldChar w:fldCharType="separate"/>
-      </w:r>
-      <w:r>
-        <w:rPr>
-          <w:vanish/>
-        </w:rPr>
-        <w:t xml:space="preserve"/>
-      </w:r>
-      <w:r>
-        <w:fldChar w:fldCharType="end"/>
-      </w:r>
-    </w:p>
     <w:p>
       <w:pPr>
         <w:spacing w:before="0" w:after="280" w:line="360" w:lineRule="exact"/>
@@ -699,7 +679,7 @@
         <w:fldChar w:fldCharType="begin"/>
       </w:r>
       <w:r>
-        <w:instrText xml:space="preserve"> ADDIN ZOTERO_ITEM CSL_CITATION {"citationID":"cCiteA01","properties":{"formattedCitation":"[1]","plainCitation":"[1]","noteIndex":0},"citationItems":[{"id":1,"itemData":{"id":1,"type":"book","title":"国史旧闻：第1卷","author":[{"family":"陈","given":"登原"}],"publisher":"中华书局","publisher-place":"北京","issued":{"date-parts":[[2000]]},"page":"29"}}],"schema":"https://github.com/citation-style-language/schema/raw/master/csl-citation.json"} </w:instrText>
+        <w:instrText xml:space="preserve"> ADDIN ZOTERO_ITEM CSL_CITATION {"citationID":"cCiteA01","properties":{"formattedCitation":"[1]","plainCitation":"[1]","noteIndex":0},"citationItems":[{"id":"chen_dengyuan_2000","itemData":{"id":"chen_dengyuan_2000","type":"book","title":"国史旧闻：第1卷","author":[{"family":"陈","given":"登原"}],"publisher":"中华书局","publisher-place":"北京","issued":{"date-parts":[[2000]]},"page":"29"}}],"schema":"https://github.com/citation-style-language/schema/raw/master/csl-citation.json"} </w:instrText>
       </w:r>
       <w:r>
         <w:fldChar w:fldCharType="separate"/>
@@ -721,7 +701,7 @@
         <w:fldChar w:fldCharType="begin"/>
       </w:r>
       <w:r>
-        <w:instrText xml:space="preserve"> ADDIN ZOTERO_ITEM CSL_CITATION {"citationID":"cCiteA02","properties":{"formattedCitation":"[2]","plainCitation":"[2]","noteIndex":0},"citationItems":[{"id":2,"itemData":{"id":2,"type":"article-journal","title":"蓝田生物群：一个认识多细胞生物起源和早期演化的新窗口","author":[{"family":"袁","given":"训来"},{"family":"陈","given":"哲"},{"family":"肖","given":"书海"}],"container-title":"科学通报","volume":"55","issue":"34","page":"3219","issued":{"date-parts":[[2012]]}}}],"schema":"https://github.com/citation-style-language/schema/raw/master/csl-citation.json"} </w:instrText>
+        <w:instrText xml:space="preserve"> ADDIN ZOTERO_ITEM CSL_CITATION {"citationID":"cCiteA02","properties":{"formattedCitation":"[2]","plainCitation":"[2]","noteIndex":0},"citationItems":[{"id":"yuan_xunlai_2012","itemData":{"id":"yuan_xunlai_2012","type":"article-journal","title":"蓝田生物群：一个认识多细胞生物起源和早期演化的新窗口","author":[{"family":"袁","given":"训来"},{"family":"陈","given":"哲"},{"family":"肖","given":"书海"}],"container-title":"科学通报","volume":"55","issue":"34","page":"3219","issued":{"date-parts":[[2012]]}}}],"schema":"https://github.com/citation-style-language/schema/raw/master/csl-citation.json"} </w:instrText>
       </w:r>
       <w:r>
         <w:fldChar w:fldCharType="separate"/>
@@ -756,7 +736,7 @@
         <w:fldChar w:fldCharType="begin"/>
       </w:r>
       <w:r>
-        <w:instrText xml:space="preserve"> ADDIN ZOTERO_ITEM CSL_CITATION {"citationID":"cCiteA03","properties":{"formattedCitation":"[3]","plainCitation":"[3]","noteIndex":0},"citationItems":[{"id":3,"itemData":{"id":3,"type":"book","title":"经济数学与金融数学","author":[{"family":"哈里森","given":""},{"family":"沃尔德伦","given":""}],"translator":[{"family":"谢","given":"远涛"}],"publisher":"中国人民大学出版社","publisher-place":"北京","issued":{"date-parts":[[2012]]},"page":"235-236"}}],"schema":"https://github.com/citation-style-language/schema/raw/master/csl-citation.json"} </w:instrText>
+        <w:instrText xml:space="preserve"> ADDIN ZOTERO_ITEM CSL_CITATION {"citationID":"cCiteA03","properties":{"formattedCitation":"[3]","plainCitation":"[3]","noteIndex":0},"citationItems":[{"id":"harrison_waldron_2012","itemData":{"id":"harrison_waldron_2012","type":"book","title":"经济数学与金融数学","author":[{"family":"哈里森","given":""},{"family":"沃尔德伦","given":""}],"translator":[{"family":"谢","given":"远涛"}],"publisher":"中国人民大学出版社","publisher-place":"北京","issued":{"date-parts":[[2012]]},"page":"235-236"}}],"schema":"https://github.com/citation-style-language/schema/raw/master/csl-citation.json"} </w:instrText>
       </w:r>
       <w:r>
         <w:fldChar w:fldCharType="separate"/>
@@ -791,7 +771,7 @@
         <w:fldChar w:fldCharType="begin"/>
       </w:r>
       <w:r>
-        <w:instrText xml:space="preserve"> ADDIN ZOTERO_ITEM CSL_CITATION {"citationID":"cCiteA04","properties":{"formattedCitation":"[4]","plainCitation":"[4]","noteIndex":0},"citationItems":[{"id":4,"itemData":{"id":4,"type":"chapter","title":"政治经济学批判","author":[{"family":"马克思","given":""}],"container-author":[{"family":"马克思","given":""},{"family":"恩格斯","given":""}],"container-title":"马克思恩格斯全集：第35卷","publisher":"人民出版社","publisher-place":"北京","issued":{"date-parts":[[2013]]},"page":"302"}}],"schema":"https://github.com/citation-style-language/schema/raw/master/csl-citation.json"} </w:instrText>
+        <w:instrText xml:space="preserve"> ADDIN ZOTERO_ITEM CSL_CITATION {"citationID":"cCiteA04","properties":{"formattedCitation":"[4]","plainCitation":"[4]","noteIndex":0},"citationItems":[{"id":"marx_2013","itemData":{"id":"marx_2013","type":"chapter","title":"政治经济学批判","author":[{"family":"马克思","given":""}],"container-author":[{"family":"马克思","given":""},{"family":"恩格斯","given":""}],"container-title":"马克思恩格斯全集：第35卷","publisher":"人民出版社","publisher-place":"北京","issued":{"date-parts":[[2013]]},"page":"302"}}],"schema":"https://github.com/citation-style-language/schema/raw/master/csl-citation.json"} </w:instrText>
       </w:r>
       <w:r>
         <w:fldChar w:fldCharType="separate"/>
@@ -826,7 +806,7 @@
         <w:fldChar w:fldCharType="begin"/>
       </w:r>
       <w:r>
-        <w:instrText xml:space="preserve"> ADDIN ZOTERO_ITEM CSL_CITATION {"citationID":"cCiteA05","properties":{"formattedCitation":"[5]","plainCitation":"[5]","noteIndex":0},"citationItems":[{"id":5,"itemData":{"id":5,"type":"report","title":"核反应堆压力管道与压力容器的LBB分析","author":[{"family":"冯","given":"西桥"}],"publisher":"清华大学核能技术设计研究院","publisher-place":"北京","issued":{"date-parts":[[1997]]}}}],"schema":"https://github.com/citation-style-language/schema/raw/master/csl-citation.json"} </w:instrText>
+        <w:instrText xml:space="preserve"> ADDIN ZOTERO_ITEM CSL_CITATION {"citationID":"cCiteA05","properties":{"formattedCitation":"[5]","plainCitation":"[5]","noteIndex":0},"citationItems":[{"id":"feng_xiqiao_1997","itemData":{"id":"feng_xiqiao_1997","type":"report","title":"核反应堆压力管道与压力容器的LBB分析","author":[{"family":"冯","given":"西桥"}],"publisher":"清华大学核能技术设计研究院","publisher-place":"北京","issued":{"date-parts":[[1997]]}}}],"schema":"https://github.com/citation-style-language/schema/raw/master/csl-citation.json"} </w:instrText>
       </w:r>
       <w:r>
         <w:fldChar w:fldCharType="separate"/>
@@ -25981,33 +25961,10 @@
 <b:Sources xmlns:b="http://schemas.openxmlformats.org/officeDocument/2006/bibliography" xmlns="http://schemas.openxmlformats.org/officeDocument/2006/bibliography" SelectedStyle="/APA.XSL" StyleName="APA"/>
 </file>
 
-<file path=customXml/item2.xml><?xml version="1.0" encoding="utf-8"?>
-<zotero:data xmlns:zotero="http://www.zotero.org/">
-  <data data-version="3" zotero-version="6.0.37">
-    <session id="LdThsZ01"/>
-    <style id="http://www.zotero.org/styles/china-national-standard-gb-t-7714-2015-numeric" locale="zh-CN" hasBibliography="1" bibliographyStyleHasBeenSet="1"/>
-    <prefs>
-      <pref name="fieldType" value="Field"/>
-      <pref name="storeReferences" value="true"/>
-      <pref name="automaticJournalAbbreviations" value="true"/>
-      <pref name="noteType" value="0"/>
-    </prefs>
-  </data>
-</zotero:data>
-</file>
-
 <file path=customXml/itemProps1.xml><?xml version="1.0" encoding="utf-8"?>
 <ds:datastoreItem xmlns:ds="http://schemas.openxmlformats.org/officeDocument/2006/customXml" ds:itemID="{EF278816-EC6F-A645-907D-7F25AECB1D4A}">
   <ds:schemaRefs>
     <ds:schemaRef ds:uri="http://schemas.openxmlformats.org/officeDocument/2006/bibliography"/>
   </ds:schemaRefs>
 </ds:datastoreItem>
-</file>
-
-<file path=customXml/itemProps2.xml><?xml version="1.0" encoding="utf-8"?>
-<ds:datastoreItem xmlns:ds="http://schemas.openxmlformats.org/officeDocument/2006/customXml" ds:itemID="{A7C3E91B-4D28-4F60-9B11-2E8C6A1D7042}">
-  <ds:schemaRefs>
-    <ds:schemaRef ds:uri="http://www.zotero.org/"/>
-  </ds:schemaRefs>
-</ds:datastoreItem>
 </file>
</xml_diff>

<commit_message>
fix: add empty uris arrays so Zotero 9 Refresh does not crash
Zotero 9 always reads citationItem.uris.length when building embedded
items from itemData. A missing uris key throws and Word shows
"Zotero 在更新文档时出错". Also store document prefs as JSON.

Co-authored-by: arena-agent <297053741+arena-agent@users.noreply.github.com>
</commit_message>
<xml_diff>
--- a/鲁东大学学术学位论文_Zotero活动引用版.docx
+++ b/鲁东大学学术学位论文_Zotero活动引用版.docx
@@ -679,7 +679,7 @@
         <w:fldChar w:fldCharType="begin"/>
       </w:r>
       <w:r>
-        <w:instrText xml:space="preserve"> ADDIN ZOTERO_ITEM CSL_CITATION {"citationID":"cCiteA01","properties":{"formattedCitation":"[1]","plainCitation":"[1]","noteIndex":0},"citationItems":[{"id":"chen_dengyuan_2000","itemData":{"id":"chen_dengyuan_2000","type":"book","title":"国史旧闻：第1卷","author":[{"family":"陈","given":"登原"}],"publisher":"中华书局","publisher-place":"北京","issued":{"date-parts":[[2000]]},"page":"29"}}],"schema":"https://github.com/citation-style-language/schema/raw/master/csl-citation.json"} </w:instrText>
+        <w:instrText xml:space="preserve"> ADDIN ZOTERO_ITEM CSL_CITATION {"citationID":"cCiteA01","properties":{"formattedCitation":"[1]","plainCitation":"[1]","noteIndex":0},"citationItems":[{"id":"chen_dengyuan_2000","uris":[],"itemData":{"id":"chen_dengyuan_2000","type":"book","title":"国史旧闻：第1卷","author":[{"family":"陈","given":"登原"}],"publisher":"中华书局","publisher-place":"北京","issued":{"date-parts":[[2000]]},"page":"29"}}],"schema":"https://github.com/citation-style-language/schema/raw/master/csl-citation.json"} </w:instrText>
       </w:r>
       <w:r>
         <w:fldChar w:fldCharType="separate"/>
@@ -701,7 +701,7 @@
         <w:fldChar w:fldCharType="begin"/>
       </w:r>
       <w:r>
-        <w:instrText xml:space="preserve"> ADDIN ZOTERO_ITEM CSL_CITATION {"citationID":"cCiteA02","properties":{"formattedCitation":"[2]","plainCitation":"[2]","noteIndex":0},"citationItems":[{"id":"yuan_xunlai_2012","itemData":{"id":"yuan_xunlai_2012","type":"article-journal","title":"蓝田生物群：一个认识多细胞生物起源和早期演化的新窗口","author":[{"family":"袁","given":"训来"},{"family":"陈","given":"哲"},{"family":"肖","given":"书海"}],"container-title":"科学通报","volume":"55","issue":"34","page":"3219","issued":{"date-parts":[[2012]]}}}],"schema":"https://github.com/citation-style-language/schema/raw/master/csl-citation.json"} </w:instrText>
+        <w:instrText xml:space="preserve"> ADDIN ZOTERO_ITEM CSL_CITATION {"citationID":"cCiteA02","properties":{"formattedCitation":"[2]","plainCitation":"[2]","noteIndex":0},"citationItems":[{"id":"yuan_xunlai_2012","uris":[],"itemData":{"id":"yuan_xunlai_2012","type":"article-journal","title":"蓝田生物群：一个认识多细胞生物起源和早期演化的新窗口","author":[{"family":"袁","given":"训来"},{"family":"陈","given":"哲"},{"family":"肖","given":"书海"}],"container-title":"科学通报","volume":"55","issue":"34","page":"3219","issued":{"date-parts":[[2012]]}}}],"schema":"https://github.com/citation-style-language/schema/raw/master/csl-citation.json"} </w:instrText>
       </w:r>
       <w:r>
         <w:fldChar w:fldCharType="separate"/>
@@ -736,7 +736,7 @@
         <w:fldChar w:fldCharType="begin"/>
       </w:r>
       <w:r>
-        <w:instrText xml:space="preserve"> ADDIN ZOTERO_ITEM CSL_CITATION {"citationID":"cCiteA03","properties":{"formattedCitation":"[3]","plainCitation":"[3]","noteIndex":0},"citationItems":[{"id":"harrison_waldron_2012","itemData":{"id":"harrison_waldron_2012","type":"book","title":"经济数学与金融数学","author":[{"family":"哈里森","given":""},{"family":"沃尔德伦","given":""}],"translator":[{"family":"谢","given":"远涛"}],"publisher":"中国人民大学出版社","publisher-place":"北京","issued":{"date-parts":[[2012]]},"page":"235-236"}}],"schema":"https://github.com/citation-style-language/schema/raw/master/csl-citation.json"} </w:instrText>
+        <w:instrText xml:space="preserve"> ADDIN ZOTERO_ITEM CSL_CITATION {"citationID":"cCiteA03","properties":{"formattedCitation":"[3]","plainCitation":"[3]","noteIndex":0},"citationItems":[{"id":"harrison_waldron_2012","uris":[],"itemData":{"id":"harrison_waldron_2012","type":"book","title":"经济数学与金融数学","author":[{"family":"哈里森"},{"family":"沃尔德伦"}],"translator":[{"family":"谢","given":"远涛"}],"publisher":"中国人民大学出版社","publisher-place":"北京","issued":{"date-parts":[[2012]]},"page":"235-236"}}],"schema":"https://github.com/citation-style-language/schema/raw/master/csl-citation.json"} </w:instrText>
       </w:r>
       <w:r>
         <w:fldChar w:fldCharType="separate"/>
@@ -771,7 +771,7 @@
         <w:fldChar w:fldCharType="begin"/>
       </w:r>
       <w:r>
-        <w:instrText xml:space="preserve"> ADDIN ZOTERO_ITEM CSL_CITATION {"citationID":"cCiteA04","properties":{"formattedCitation":"[4]","plainCitation":"[4]","noteIndex":0},"citationItems":[{"id":"marx_2013","itemData":{"id":"marx_2013","type":"chapter","title":"政治经济学批判","author":[{"family":"马克思","given":""}],"container-author":[{"family":"马克思","given":""},{"family":"恩格斯","given":""}],"container-title":"马克思恩格斯全集：第35卷","publisher":"人民出版社","publisher-place":"北京","issued":{"date-parts":[[2013]]},"page":"302"}}],"schema":"https://github.com/citation-style-language/schema/raw/master/csl-citation.json"} </w:instrText>
+        <w:instrText xml:space="preserve"> ADDIN ZOTERO_ITEM CSL_CITATION {"citationID":"cCiteA04","properties":{"formattedCitation":"[4]","plainCitation":"[4]","noteIndex":0},"citationItems":[{"id":"marx_2013","uris":[],"itemData":{"id":"marx_2013","type":"chapter","title":"政治经济学批判","author":[{"family":"马克思"}],"container-author":[{"family":"马克思"},{"family":"恩格斯"}],"container-title":"马克思恩格斯全集：第35卷","publisher":"人民出版社","publisher-place":"北京","issued":{"date-parts":[[2013]]},"page":"302"}}],"schema":"https://github.com/citation-style-language/schema/raw/master/csl-citation.json"} </w:instrText>
       </w:r>
       <w:r>
         <w:fldChar w:fldCharType="separate"/>
@@ -806,7 +806,7 @@
         <w:fldChar w:fldCharType="begin"/>
       </w:r>
       <w:r>
-        <w:instrText xml:space="preserve"> ADDIN ZOTERO_ITEM CSL_CITATION {"citationID":"cCiteA05","properties":{"formattedCitation":"[5]","plainCitation":"[5]","noteIndex":0},"citationItems":[{"id":"feng_xiqiao_1997","itemData":{"id":"feng_xiqiao_1997","type":"report","title":"核反应堆压力管道与压力容器的LBB分析","author":[{"family":"冯","given":"西桥"}],"publisher":"清华大学核能技术设计研究院","publisher-place":"北京","issued":{"date-parts":[[1997]]}}}],"schema":"https://github.com/citation-style-language/schema/raw/master/csl-citation.json"} </w:instrText>
+        <w:instrText xml:space="preserve"> ADDIN ZOTERO_ITEM CSL_CITATION {"citationID":"cCiteA05","properties":{"formattedCitation":"[5]","plainCitation":"[5]","noteIndex":0},"citationItems":[{"id":"feng_xiqiao_1997","uris":[],"itemData":{"id":"feng_xiqiao_1997","type":"report","title":"核反应堆压力管道与压力容器的LBB分析","author":[{"family":"冯","given":"西桥"}],"publisher":"清华大学核能技术设计研究院","publisher-place":"北京","issued":{"date-parts":[[1997]]}}}],"schema":"https://github.com/citation-style-language/schema/raw/master/csl-citation.json"} </w:instrText>
       </w:r>
       <w:r>
         <w:fldChar w:fldCharType="separate"/>

</xml_diff>